<commit_message>
Promote approved Batch 4 localized figures
</commit_message>
<xml_diff>
--- a/01-foundations/NIST_RMF_SP_800-53/Portugues_BR/NIST_RMF_and_SP_800-53_Release_5.2.0_Practical_Manual_Portugues_BR_v1.0.docx
+++ b/01-foundations/NIST_RMF_SP_800-53/Portugues_BR/NIST_RMF_and_SP_800-53_Release_5.2.0_Practical_Manual_Portugues_BR_v1.0.docx
@@ -1817,7 +1817,7 @@
       </w:r>
     </w:p>
     <w:bookmarkEnd w:id="22"/>
-    <w:bookmarkStart w:id="24" w:name="fundação-rmf-e-sp-800-53"/>
+    <w:bookmarkStart w:id="27" w:name="fundação-rmf-e-sp-800-53"/>
     <w:p>
       <w:pPr>
         <w:pStyle w:val="Heading1"/>
@@ -1836,8 +1836,58 @@
     </w:p>
     <w:p>
       <w:pPr>
-        <w:pStyle w:val="BodyText"/>
-      </w:pPr>
+        <w:pStyle w:val="CaptionedFigure"/>
+      </w:pPr>
+      <w:r>
+        <w:drawing>
+          <wp:inline>
+            <wp:extent cx="5334000" cy="2945449"/>
+            <wp:effectExtent b="0" l="0" r="0" t="0"/>
+            <wp:docPr descr="Prepare suporta cada passo, e Monitor alimenta novas informações de volta às decisões de risco." title="" id="24" name="Picture"/>
+            <a:graphic>
+              <a:graphicData uri="http://schemas.openxmlformats.org/drawingml/2006/picture">
+                <pic:pic>
+                  <pic:nvPicPr>
+                    <pic:cNvPr descr="media/image1.png" id="25" name="Picture"/>
+                    <pic:cNvPicPr>
+                      <a:picLocks noChangeArrowheads="1" noChangeAspect="1"/>
+                    </pic:cNvPicPr>
+                  </pic:nvPicPr>
+                  <pic:blipFill>
+                    <a:blip r:embed="rId23"/>
+                    <a:stretch>
+                      <a:fillRect/>
+                    </a:stretch>
+                  </pic:blipFill>
+                  <pic:spPr bwMode="auto">
+                    <a:xfrm>
+                      <a:off x="0" y="0"/>
+                      <a:ext cx="5334000" cy="2945449"/>
+                    </a:xfrm>
+                    <a:prstGeom prst="rect">
+                      <a:avLst/>
+                    </a:prstGeom>
+                    <a:noFill/>
+                    <a:ln w="9525">
+                      <a:noFill/>
+                      <a:headEnd/>
+                      <a:tailEnd/>
+                    </a:ln>
+                  </pic:spPr>
+                </pic:pic>
+              </a:graphicData>
+            </a:graphic>
+          </wp:inline>
+        </w:drawing>
+      </w:r>
+    </w:p>
+    <w:p>
+      <w:pPr>
+        <w:pStyle w:val="ImageCaption"/>
+      </w:pPr>
+      <w:r>
+        <w:t xml:space="preserve">Prepare suporta cada passo, e Monitor alimenta novas informações de volta às decisões de risco.</w:t>
+      </w:r>
     </w:p>
     <w:p>
       <w:pPr>
@@ -1847,7 +1897,7 @@
         <w:t xml:space="preserve">Figura 1. Sete passos RMF</w:t>
       </w:r>
     </w:p>
-    <w:bookmarkStart w:id="23" w:name="não-é-o-mesmo-que"/>
+    <w:bookmarkStart w:id="26" w:name="não-é-o-mesmo-que"/>
     <w:p>
       <w:pPr>
         <w:pStyle w:val="Heading2"/>
@@ -1918,9 +1968,9 @@
         <w:t xml:space="preserve">□———————————————————————————————————————————————————————————————————————————–</w:t>
       </w:r>
     </w:p>
-    <w:bookmarkEnd w:id="23"/>
-    <w:bookmarkEnd w:id="24"/>
-    <w:bookmarkStart w:id="26" w:name="current-nist-publication-suite"/>
+    <w:bookmarkEnd w:id="26"/>
+    <w:bookmarkEnd w:id="27"/>
+    <w:bookmarkStart w:id="29" w:name="current-nist-publication-suite"/>
     <w:p>
       <w:pPr>
         <w:pStyle w:val="Heading1"/>
@@ -1941,7 +1991,7 @@
         <w:t xml:space="preserve">Use a fonte oficial atual e entenda como cada publicação suporta o todo.</w:t>
       </w:r>
     </w:p>
-    <w:bookmarkStart w:id="25" w:name="publicaçãorecurso-uso-actual"/>
+    <w:bookmarkStart w:id="28" w:name="publicaçãorecurso-uso-actual"/>
     <w:p>
       <w:pPr>
         <w:pStyle w:val="Heading2"/>
@@ -2044,9 +2094,9 @@
         <w:t xml:space="preserve">O que é que se passa?</w:t>
       </w:r>
     </w:p>
-    <w:bookmarkEnd w:id="25"/>
-    <w:bookmarkEnd w:id="26"/>
-    <w:bookmarkStart w:id="27" w:name="governança-funções-e-decisões-de-risco"/>
+    <w:bookmarkEnd w:id="28"/>
+    <w:bookmarkEnd w:id="29"/>
+    <w:bookmarkStart w:id="33" w:name="governança-funções-e-decisões-de-risco"/>
     <w:p>
       <w:pPr>
         <w:pStyle w:val="Heading1"/>
@@ -2069,8 +2119,58 @@
     </w:p>
     <w:p>
       <w:pPr>
-        <w:pStyle w:val="BodyText"/>
-      </w:pPr>
+        <w:pStyle w:val="CaptionedFigure"/>
+      </w:pPr>
+      <w:r>
+        <w:drawing>
+          <wp:inline>
+            <wp:extent cx="5334000" cy="2945449"/>
+            <wp:effectExtent b="0" l="0" r="0" t="0"/>
+            <wp:docPr descr="Enterprise direction, mission/business needs, and system controls must stay connected." title="" id="31" name="Picture"/>
+            <a:graphic>
+              <a:graphicData uri="http://schemas.openxmlformats.org/drawingml/2006/picture">
+                <pic:pic>
+                  <pic:nvPicPr>
+                    <pic:cNvPr descr="media/image2.png" id="32" name="Picture"/>
+                    <pic:cNvPicPr>
+                      <a:picLocks noChangeArrowheads="1" noChangeAspect="1"/>
+                    </pic:cNvPicPr>
+                  </pic:nvPicPr>
+                  <pic:blipFill>
+                    <a:blip r:embed="rId30"/>
+                    <a:stretch>
+                      <a:fillRect/>
+                    </a:stretch>
+                  </pic:blipFill>
+                  <pic:spPr bwMode="auto">
+                    <a:xfrm>
+                      <a:off x="0" y="0"/>
+                      <a:ext cx="5334000" cy="2945449"/>
+                    </a:xfrm>
+                    <a:prstGeom prst="rect">
+                      <a:avLst/>
+                    </a:prstGeom>
+                    <a:noFill/>
+                    <a:ln w="9525">
+                      <a:noFill/>
+                      <a:headEnd/>
+                      <a:tailEnd/>
+                    </a:ln>
+                  </pic:spPr>
+                </pic:pic>
+              </a:graphicData>
+            </a:graphic>
+          </wp:inline>
+        </w:drawing>
+      </w:r>
+    </w:p>
+    <w:p>
+      <w:pPr>
+        <w:pStyle w:val="ImageCaption"/>
+      </w:pPr>
+      <w:r>
+        <w:t xml:space="preserve">Enterprise direction, mission/business needs, and system controls must stay connected.</w:t>
+      </w:r>
     </w:p>
     <w:p>
       <w:pPr>
@@ -2160,8 +2260,8 @@
         <w:t xml:space="preserve">Arquiteto empresarial / proprietário da missão</w:t>
       </w:r>
     </w:p>
-    <w:bookmarkEnd w:id="27"/>
-    <w:bookmarkStart w:id="30" w:name="X19123fecfe4e0a0f6c0f22a25aaa3b59a7f0198"/>
+    <w:bookmarkEnd w:id="33"/>
+    <w:bookmarkStart w:id="36" w:name="X19123fecfe4e0a0f6c0f22a25aaa3b59a7f0198"/>
     <w:p>
       <w:pPr>
         <w:pStyle w:val="Heading1"/>
@@ -2182,7 +2282,7 @@
         <w:t xml:space="preserve">Um limite claro é a base para categorização, controles, avaliação e autorização.</w:t>
       </w:r>
     </w:p>
-    <w:bookmarkStart w:id="28" w:name="perguntas-de-limite"/>
+    <w:bookmarkStart w:id="34" w:name="perguntas-de-limite"/>
     <w:p>
       <w:pPr>
         <w:pStyle w:val="Heading2"/>
@@ -2257,8 +2357,8 @@
         <w:t xml:space="preserve">Quais mudanças requerem recategorização, reseleção, reavaliação ou revisão de autorização?</w:t>
       </w:r>
     </w:p>
-    <w:bookmarkEnd w:id="28"/>
-    <w:bookmarkStart w:id="29" w:name="o-que-deve-mostrar"/>
+    <w:bookmarkEnd w:id="34"/>
+    <w:bookmarkStart w:id="35" w:name="o-que-deve-mostrar"/>
     <w:p>
       <w:pPr>
         <w:pStyle w:val="Heading2"/>
@@ -2305,9 +2405,9 @@
         <w:t xml:space="preserve">□ Alocação de controle □ Comum, híbrido, específico do sistema, herdado, provedor, responsabilidades do cliente</w:t>
       </w:r>
     </w:p>
-    <w:bookmarkEnd w:id="29"/>
-    <w:bookmarkEnd w:id="30"/>
-    <w:bookmarkStart w:id="32" w:name="prepare-se-ao-nível-da-organização"/>
+    <w:bookmarkEnd w:id="35"/>
+    <w:bookmarkEnd w:id="36"/>
+    <w:bookmarkStart w:id="38" w:name="prepare-se-ao-nível-da-organização"/>
     <w:p>
       <w:pPr>
         <w:pStyle w:val="Heading1"/>
@@ -2328,7 +2428,7 @@
         <w:t xml:space="preserve">Preparação de nível de organização faz o sistema RMF funcionar de forma consistente e eficiente.*</w:t>
       </w:r>
     </w:p>
-    <w:bookmarkStart w:id="31" w:name="preparação-da-organização"/>
+    <w:bookmarkStart w:id="37" w:name="preparação-da-organização"/>
     <w:p>
       <w:pPr>
         <w:pStyle w:val="Heading2"/>
@@ -2417,9 +2517,9 @@
         <w:t xml:space="preserve">□—————————————————————————————————————————————————————————————————————————————————————————————————————–</w:t>
       </w:r>
     </w:p>
-    <w:bookmarkEnd w:id="31"/>
-    <w:bookmarkEnd w:id="32"/>
-    <w:bookmarkStart w:id="33" w:name="prepare-se-ao-nível-do-sistema"/>
+    <w:bookmarkEnd w:id="37"/>
+    <w:bookmarkEnd w:id="38"/>
+    <w:bookmarkStart w:id="39" w:name="prepare-se-ao-nível-do-sistema"/>
     <w:p>
       <w:pPr>
         <w:pStyle w:val="Heading1"/>
@@ -2514,8 +2614,8 @@
         <w:t xml:space="preserve">Documento suposições, restrições, riscos, decisões necessárias, e agenda de pacotes.</w:t>
       </w:r>
     </w:p>
-    <w:bookmarkEnd w:id="33"/>
-    <w:bookmarkStart w:id="34" w:name="categorizar-o-sistema"/>
+    <w:bookmarkEnd w:id="39"/>
+    <w:bookmarkStart w:id="43" w:name="categorizar-o-sistema"/>
     <w:p>
       <w:pPr>
         <w:pStyle w:val="Heading1"/>
@@ -2538,8 +2638,58 @@
     </w:p>
     <w:p>
       <w:pPr>
-        <w:pStyle w:val="BodyText"/>
-      </w:pPr>
+        <w:pStyle w:val="CaptionedFigure"/>
+      </w:pPr>
+      <w:r>
+        <w:drawing>
+          <wp:inline>
+            <wp:extent cx="5334000" cy="2945449"/>
+            <wp:effectExtent b="0" l="0" r="0" t="0"/>
+            <wp:docPr descr="Categorização começa com impacto da informação e produz um nível de impacto do sistema aprovado." title="" id="41" name="Picture"/>
+            <a:graphic>
+              <a:graphicData uri="http://schemas.openxmlformats.org/drawingml/2006/picture">
+                <pic:pic>
+                  <pic:nvPicPr>
+                    <pic:cNvPr descr="media/image3.png" id="42" name="Picture"/>
+                    <pic:cNvPicPr>
+                      <a:picLocks noChangeArrowheads="1" noChangeAspect="1"/>
+                    </pic:cNvPicPr>
+                  </pic:nvPicPr>
+                  <pic:blipFill>
+                    <a:blip r:embed="rId40"/>
+                    <a:stretch>
+                      <a:fillRect/>
+                    </a:stretch>
+                  </pic:blipFill>
+                  <pic:spPr bwMode="auto">
+                    <a:xfrm>
+                      <a:off x="0" y="0"/>
+                      <a:ext cx="5334000" cy="2945449"/>
+                    </a:xfrm>
+                    <a:prstGeom prst="rect">
+                      <a:avLst/>
+                    </a:prstGeom>
+                    <a:noFill/>
+                    <a:ln w="9525">
+                      <a:noFill/>
+                      <a:headEnd/>
+                      <a:tailEnd/>
+                    </a:ln>
+                  </pic:spPr>
+                </pic:pic>
+              </a:graphicData>
+            </a:graphic>
+          </wp:inline>
+        </w:drawing>
+      </w:r>
+    </w:p>
+    <w:p>
+      <w:pPr>
+        <w:pStyle w:val="ImageCaption"/>
+      </w:pPr>
+      <w:r>
+        <w:t xml:space="preserve">Categorização começa com impacto da informação e produz um nível de impacto do sistema aprovado.</w:t>
+      </w:r>
     </w:p>
     <w:p>
       <w:pPr>
@@ -2626,8 +2776,8 @@
         <w:t xml:space="preserve">O que é que se passa?</w:t>
       </w:r>
     </w:p>
-    <w:bookmarkEnd w:id="34"/>
-    <w:bookmarkStart w:id="35" w:name="selecione-controles"/>
+    <w:bookmarkEnd w:id="43"/>
+    <w:bookmarkStart w:id="44" w:name="selecione-controles"/>
     <w:p>
       <w:pPr>
         <w:pStyle w:val="Heading1"/>
@@ -2648,8 +2798,8 @@
         <w:t xml:space="preserve">Seleção cria um conjunto personalizado de controles que aborda o sistema e risco organizacional.</w:t>
       </w:r>
     </w:p>
-    <w:bookmarkEnd w:id="35"/>
-    <w:bookmarkStart w:id="37" w:name="sequência-de-seleção"/>
+    <w:bookmarkEnd w:id="44"/>
+    <w:bookmarkStart w:id="46" w:name="sequência-de-seleção"/>
     <w:p>
       <w:pPr>
         <w:pStyle w:val="Heading1"/>
@@ -2773,7 +2923,7 @@
         <w:t xml:space="preserve">Implementação transforma controles selecionados em salvaguardas reais, atribuídas, configuradas e operadas.*</w:t>
       </w:r>
     </w:p>
-    <w:bookmarkStart w:id="36" w:name="fluxo-de-trabalho-de-implementação"/>
+    <w:bookmarkStart w:id="45" w:name="fluxo-de-trabalho-de-implementação"/>
     <w:p>
       <w:pPr>
         <w:pStyle w:val="Heading2"/>
@@ -2859,9 +3009,9 @@
         <w:t xml:space="preserve">Correct design ou falhas de operação antes da avaliação formal, quando possível.</w:t>
       </w:r>
     </w:p>
-    <w:bookmarkEnd w:id="36"/>
-    <w:bookmarkEnd w:id="37"/>
-    <w:bookmarkStart w:id="40" w:name="assess-controls"/>
+    <w:bookmarkEnd w:id="45"/>
+    <w:bookmarkEnd w:id="46"/>
+    <w:bookmarkStart w:id="49" w:name="assess-controls"/>
     <w:p>
       <w:pPr>
         <w:pStyle w:val="Heading1"/>
@@ -2882,7 +3032,7 @@
         <w:t xml:space="preserve">Avaliação determina se os controles são implementados corretamente, funcionando como pretendido, e produzindo o resultado desejado.</w:t>
       </w:r>
     </w:p>
-    <w:bookmarkStart w:id="38" w:name="sequência-de-avaliação"/>
+    <w:bookmarkStart w:id="47" w:name="sequência-de-avaliação"/>
     <w:p>
       <w:pPr>
         <w:pStyle w:val="Heading2"/>
@@ -2968,8 +3118,8 @@
         <w:t xml:space="preserve">Emitir um relatório de avaliação que apoie a decisão do funcionário autorizador sem esconder incertezas.</w:t>
       </w:r>
     </w:p>
-    <w:bookmarkEnd w:id="38"/>
-    <w:bookmarkStart w:id="39" w:name="X76744f15978cbf91c2415fb6a80c8e09bc0a26a"/>
+    <w:bookmarkEnd w:id="47"/>
+    <w:bookmarkStart w:id="48" w:name="X76744f15978cbf91c2415fb6a80c8e09bc0a26a"/>
     <w:p>
       <w:pPr>
         <w:pStyle w:val="Heading2"/>
@@ -2978,9 +3128,9 @@
         <w:t xml:space="preserve">A avaliação não é uma análise: ** Resultados automatizados podem testar condições importantes em escala, mas a avaliação também requer critérios, escopo, população, desenho, contexto operacional, revisão humana, limitações e análise de risco. □</w:t>
       </w:r>
     </w:p>
-    <w:bookmarkEnd w:id="39"/>
-    <w:bookmarkEnd w:id="40"/>
-    <w:bookmarkStart w:id="43" w:name="autorizar-o-sistema-ou-controles-comuns"/>
+    <w:bookmarkEnd w:id="48"/>
+    <w:bookmarkEnd w:id="49"/>
+    <w:bookmarkStart w:id="55" w:name="autorizar-o-sistema-ou-controles-comuns"/>
     <w:p>
       <w:pPr>
         <w:pStyle w:val="Heading1"/>
@@ -3003,8 +3153,58 @@
     </w:p>
     <w:p>
       <w:pPr>
-        <w:pStyle w:val="BodyText"/>
-      </w:pPr>
+        <w:pStyle w:val="CaptionedFigure"/>
+      </w:pPr>
+      <w:r>
+        <w:drawing>
+          <wp:inline>
+            <wp:extent cx="5334000" cy="2945449"/>
+            <wp:effectExtent b="0" l="0" r="0" t="0"/>
+            <wp:docPr descr="O pacote suporta uma decisão responsável com escopo definido, condições, duração e monitoramento." title="" id="51" name="Picture"/>
+            <a:graphic>
+              <a:graphicData uri="http://schemas.openxmlformats.org/drawingml/2006/picture">
+                <pic:pic>
+                  <pic:nvPicPr>
+                    <pic:cNvPr descr="media/image4.png" id="52" name="Picture"/>
+                    <pic:cNvPicPr>
+                      <a:picLocks noChangeArrowheads="1" noChangeAspect="1"/>
+                    </pic:cNvPicPr>
+                  </pic:nvPicPr>
+                  <pic:blipFill>
+                    <a:blip r:embed="rId50"/>
+                    <a:stretch>
+                      <a:fillRect/>
+                    </a:stretch>
+                  </pic:blipFill>
+                  <pic:spPr bwMode="auto">
+                    <a:xfrm>
+                      <a:off x="0" y="0"/>
+                      <a:ext cx="5334000" cy="2945449"/>
+                    </a:xfrm>
+                    <a:prstGeom prst="rect">
+                      <a:avLst/>
+                    </a:prstGeom>
+                    <a:noFill/>
+                    <a:ln w="9525">
+                      <a:noFill/>
+                      <a:headEnd/>
+                      <a:tailEnd/>
+                    </a:ln>
+                  </pic:spPr>
+                </pic:pic>
+              </a:graphicData>
+            </a:graphic>
+          </wp:inline>
+        </w:drawing>
+      </w:r>
+    </w:p>
+    <w:p>
+      <w:pPr>
+        <w:pStyle w:val="ImageCaption"/>
+      </w:pPr>
+      <w:r>
+        <w:t xml:space="preserve">O pacote suporta uma decisão responsável com escopo definido, condições, duração e monitoramento.</w:t>
+      </w:r>
     </w:p>
     <w:p>
       <w:pPr>
@@ -3014,7 +3214,7 @@
         <w:t xml:space="preserve">Figura 7. Decisão de autorização de risco</w:t>
       </w:r>
     </w:p>
-    <w:bookmarkStart w:id="41" w:name="pacote-de-autorização"/>
+    <w:bookmarkStart w:id="53" w:name="pacote-de-autorização"/>
     <w:p>
       <w:pPr>
         <w:pStyle w:val="Heading2"/>
@@ -3133,8 +3333,8 @@
         <w:t xml:space="preserve">• Abordagem de autorização em curso • Evidências correntes frequentes suportam decisões de risco contínuas sob critérios aprovados</w:t>
       </w:r>
     </w:p>
-    <w:bookmarkEnd w:id="41"/>
-    <w:bookmarkStart w:id="42" w:name="Xac9d126218087070c9e6b5c246f96ed29d40a25"/>
+    <w:bookmarkEnd w:id="53"/>
+    <w:bookmarkStart w:id="54" w:name="Xac9d126218087070c9e6b5c246f96ed29d40a25"/>
     <w:p>
       <w:pPr>
         <w:pStyle w:val="Heading2"/>
@@ -3143,9 +3343,9 @@
         <w:t xml:space="preserve">Não é uma certificação:** Autorização não significa que o sistema é livre de risco ou compatível para sempre. É uma aceitação documentada do risco residual atual por um funcionário com autoridade. □</w:t>
       </w:r>
     </w:p>
-    <w:bookmarkEnd w:id="42"/>
-    <w:bookmarkEnd w:id="43"/>
-    <w:bookmarkStart w:id="46" w:name="monitore-continuamente"/>
+    <w:bookmarkEnd w:id="54"/>
+    <w:bookmarkEnd w:id="55"/>
+    <w:bookmarkStart w:id="58" w:name="monitore-continuamente"/>
     <w:p>
       <w:pPr>
         <w:pStyle w:val="Heading1"/>
@@ -3166,7 +3366,7 @@
         <w:t xml:space="preserve">Monitor rastreia controles, mudanças de sistema, ameaça, descobertas e risco após a autorização.</w:t>
       </w:r>
     </w:p>
-    <w:bookmarkStart w:id="44" w:name="actividades-de-monitorização"/>
+    <w:bookmarkStart w:id="56" w:name="actividades-de-monitorização"/>
     <w:p>
       <w:pPr>
         <w:pStyle w:val="Heading2"/>
@@ -3241,8 +3441,8 @@
         <w:t xml:space="preserve">Corrigir fraquezas, reteste, e determinar se mudança significativa ou risco aumentado requer reautorização ou termos alterados.</w:t>
       </w:r>
     </w:p>
-    <w:bookmarkEnd w:id="44"/>
-    <w:bookmarkStart w:id="45" w:name="Xc17dc286339c0bb49fd8d7d7bedc43c4ca2c0aa"/>
+    <w:bookmarkEnd w:id="56"/>
+    <w:bookmarkStart w:id="57" w:name="Xc17dc286339c0bb49fd8d7d7bedc43c4ca2c0aa"/>
     <w:p>
       <w:pPr>
         <w:pStyle w:val="Heading2"/>
@@ -3261,9 +3461,9 @@
         <w:t xml:space="preserve">Colete apenas evidências que tenham um proprietário, propósito, regra de qualidade, limiar, cadência de revisão, escalada e resposta. Mais painéis não melhoram automaticamente o gerenciamento de riscos. □</w:t>
       </w:r>
     </w:p>
-    <w:bookmarkEnd w:id="45"/>
-    <w:bookmarkEnd w:id="46"/>
-    <w:bookmarkStart w:id="48" w:name="bases-de-controle-e-alfaiataria"/>
+    <w:bookmarkEnd w:id="57"/>
+    <w:bookmarkEnd w:id="58"/>
+    <w:bookmarkStart w:id="63" w:name="bases-de-controle-e-alfaiataria"/>
     <w:p>
       <w:pPr>
         <w:pStyle w:val="Heading1"/>
@@ -3286,8 +3486,58 @@
     </w:p>
     <w:p>
       <w:pPr>
-        <w:pStyle w:val="BodyText"/>
-      </w:pPr>
+        <w:pStyle w:val="CaptionedFigure"/>
+      </w:pPr>
+      <w:r>
+        <w:drawing>
+          <wp:inline>
+            <wp:extent cx="5334000" cy="2945449"/>
+            <wp:effectExtent b="0" l="0" r="0" t="0"/>
+            <wp:docPr descr="Tailoring altera uma linha de base inicial em um conjunto de controle documentado baseado em risco." title="" id="60" name="Picture"/>
+            <a:graphic>
+              <a:graphicData uri="http://schemas.openxmlformats.org/drawingml/2006/picture">
+                <pic:pic>
+                  <pic:nvPicPr>
+                    <pic:cNvPr descr="media/image5.png" id="61" name="Picture"/>
+                    <pic:cNvPicPr>
+                      <a:picLocks noChangeArrowheads="1" noChangeAspect="1"/>
+                    </pic:cNvPicPr>
+                  </pic:nvPicPr>
+                  <pic:blipFill>
+                    <a:blip r:embed="rId59"/>
+                    <a:stretch>
+                      <a:fillRect/>
+                    </a:stretch>
+                  </pic:blipFill>
+                  <pic:spPr bwMode="auto">
+                    <a:xfrm>
+                      <a:off x="0" y="0"/>
+                      <a:ext cx="5334000" cy="2945449"/>
+                    </a:xfrm>
+                    <a:prstGeom prst="rect">
+                      <a:avLst/>
+                    </a:prstGeom>
+                    <a:noFill/>
+                    <a:ln w="9525">
+                      <a:noFill/>
+                      <a:headEnd/>
+                      <a:tailEnd/>
+                    </a:ln>
+                  </pic:spPr>
+                </pic:pic>
+              </a:graphicData>
+            </a:graphic>
+          </wp:inline>
+        </w:drawing>
+      </w:r>
+    </w:p>
+    <w:p>
+      <w:pPr>
+        <w:pStyle w:val="ImageCaption"/>
+      </w:pPr>
+      <w:r>
+        <w:t xml:space="preserve">Tailoring altera uma linha de base inicial em um conjunto de controle documentado baseado em risco.</w:t>
+      </w:r>
     </w:p>
     <w:p>
       <w:pPr>
@@ -3297,7 +3547,7 @@
         <w:t xml:space="preserve">Figura 4. Personalização de controle</w:t>
       </w:r>
     </w:p>
-    <w:bookmarkStart w:id="47" w:name="baselina-purpose"/>
+    <w:bookmarkStart w:id="62" w:name="baselina-purpose"/>
     <w:p>
       <w:pPr>
         <w:pStyle w:val="Heading2"/>
@@ -3346,9 +3596,9 @@
         <w:t xml:space="preserve">Privacy (Privacy) Controles de privacidade aplicados com base no risco de processamento e privacidade, não apenas no nível de impacto do sistema</w:t>
       </w:r>
     </w:p>
-    <w:bookmarkEnd w:id="47"/>
-    <w:bookmarkEnd w:id="48"/>
-    <w:bookmarkStart w:id="49" w:name="registro-de-alfaiataria"/>
+    <w:bookmarkEnd w:id="62"/>
+    <w:bookmarkEnd w:id="63"/>
+    <w:bookmarkStart w:id="64" w:name="registro-de-alfaiataria"/>
     <w:p>
       <w:pPr>
         <w:pStyle w:val="Heading1"/>
@@ -3434,8 +3684,8 @@
         <w:t xml:space="preserve">Risco residual, aprovação, data e futuro gatilho de revisão.</w:t>
       </w:r>
     </w:p>
-    <w:bookmarkEnd w:id="49"/>
-    <w:bookmarkStart w:id="51" w:name="X55f9a48a4d7926efc85dad9b3fa3232cd5b0a75"/>
+    <w:bookmarkEnd w:id="64"/>
+    <w:bookmarkStart w:id="66" w:name="X55f9a48a4d7926efc85dad9b3fa3232cd5b0a75"/>
     <w:p>
       <w:pPr>
         <w:pStyle w:val="Heading1"/>
@@ -3456,7 +3706,7 @@
         <w:t xml:space="preserve">Control alocation explica quem fornece cada controle e qual parte do sistema deve implementar.*</w:t>
       </w:r>
     </w:p>
-    <w:bookmarkStart w:id="50" w:name="tipo-tipo-tipo-método-exemplo"/>
+    <w:bookmarkStart w:id="65" w:name="tipo-tipo-tipo-método-exemplo"/>
     <w:p>
       <w:pPr>
         <w:pStyle w:val="Heading2"/>
@@ -3560,9 +3810,9 @@
         <w:t xml:space="preserve">Se o controlo comum falhar ou se tornar indisponível, os sistemas afectados reavaliam o risco e a resposta.</w:t>
       </w:r>
     </w:p>
-    <w:bookmarkEnd w:id="50"/>
-    <w:bookmarkEnd w:id="51"/>
-    <w:bookmarkStart w:id="54" w:name="Xcc46f15445c97743b9644db10757a7f473184d8"/>
+    <w:bookmarkEnd w:id="65"/>
+    <w:bookmarkEnd w:id="66"/>
+    <w:bookmarkStart w:id="72" w:name="Xcc46f15445c97743b9644db10757a7f473184d8"/>
     <w:p>
       <w:pPr>
         <w:pStyle w:val="Heading1"/>
@@ -3585,238 +3835,338 @@
     </w:p>
     <w:p>
       <w:pPr>
+        <w:pStyle w:val="CaptionedFigure"/>
+      </w:pPr>
+      <w:r>
+        <w:drawing>
+          <wp:inline>
+            <wp:extent cx="5334000" cy="2945449"/>
+            <wp:effectExtent b="0" l="0" r="0" t="0"/>
+            <wp:docPr descr="Identificadores de controle sozinhos são insuficientes; leitura de requisitos, parâmetros, discussão e melhorias juntos." title="" id="68" name="Picture"/>
+            <a:graphic>
+              <a:graphicData uri="http://schemas.openxmlformats.org/drawingml/2006/picture">
+                <pic:pic>
+                  <pic:nvPicPr>
+                    <pic:cNvPr descr="media/image6.png" id="69" name="Picture"/>
+                    <pic:cNvPicPr>
+                      <a:picLocks noChangeArrowheads="1" noChangeAspect="1"/>
+                    </pic:cNvPicPr>
+                  </pic:nvPicPr>
+                  <pic:blipFill>
+                    <a:blip r:embed="rId67"/>
+                    <a:stretch>
+                      <a:fillRect/>
+                    </a:stretch>
+                  </pic:blipFill>
+                  <pic:spPr bwMode="auto">
+                    <a:xfrm>
+                      <a:off x="0" y="0"/>
+                      <a:ext cx="5334000" cy="2945449"/>
+                    </a:xfrm>
+                    <a:prstGeom prst="rect">
+                      <a:avLst/>
+                    </a:prstGeom>
+                    <a:noFill/>
+                    <a:ln w="9525">
+                      <a:noFill/>
+                      <a:headEnd/>
+                      <a:tailEnd/>
+                    </a:ln>
+                  </pic:spPr>
+                </pic:pic>
+              </a:graphicData>
+            </a:graphic>
+          </wp:inline>
+        </w:drawing>
+      </w:r>
+    </w:p>
+    <w:p>
+      <w:pPr>
+        <w:pStyle w:val="ImageCaption"/>
+      </w:pPr>
+      <w:r>
+        <w:t xml:space="preserve">Identificadores de controle sozinhos são insuficientes; leitura de requisitos, parâmetros, discussão e melhorias juntos.</w:t>
+      </w:r>
+    </w:p>
+    <w:p>
+      <w:pPr>
+        <w:pStyle w:val="BodyText"/>
+      </w:pPr>
+      <w:r>
+        <w:t xml:space="preserve">Figura 5. Anatomia de controle</w:t>
+      </w:r>
+    </w:p>
+    <w:p>
+      <w:pPr>
+        <w:numPr>
+          <w:ilvl w:val="0"/>
+          <w:numId w:val="1021"/>
+        </w:numPr>
+        <w:pStyle w:val="Heading2"/>
+      </w:pPr>
+      <w:bookmarkStart w:id="70" w:name="Xedc10af444e551c1fab18e313a051886c486d42"/>
+      <w:r>
+        <w:t xml:space="preserve">Declaração fraca** ** Padrão de instrução de Stronger**</w:t>
+      </w:r>
+      <w:bookmarkEnd w:id="70"/>
+    </w:p>
+    <w:p>
+      <w:pPr>
+        <w:numPr>
+          <w:ilvl w:val="0"/>
+          <w:numId w:val="1000"/>
+        </w:numPr>
+        <w:pStyle w:val="Compact"/>
+      </w:pPr>
+      <w:r>
+        <w:t xml:space="preserve">A organização usa o MFA. A equipe de identidade requer MFA resistente a phishing para funções de administrador nomeadas através do serviço de identidade aprovado; inscrições, exceções e revisão trimestral de cobertura são registradas em sistemas especificados. □</w:t>
+      </w:r>
+      <w:r>
+        <w:t xml:space="preserve"> </w:t>
+      </w:r>
+      <w:r>
+        <w:t xml:space="preserve">Os logs são revisados. As revisões de operações de segurança definiram eventos de alto risco continuamente através do SIEM e realizam revisão diária documentada de logons administrativos fracassados; os casos e exceções são mantidos para o período aprovado.</w:t>
+      </w:r>
+      <w:r>
+        <w:t xml:space="preserve"> </w:t>
+      </w:r>
+      <w:r>
+        <w:t xml:space="preserve">Os backups são realizados. As operações criam backups diários criptografados dos bancos de dados Tier 1 listados, mantém uma cópia isolada, monitora falhas e executa testes de restauração trimestrais contra RTO de quatro horas e RPO de 30 minutos.</w:t>
+      </w:r>
+    </w:p>
+    <w:bookmarkStart w:id="71" w:name="lista-de-verificação-da-declaração"/>
+    <w:p>
+      <w:pPr>
+        <w:pStyle w:val="Heading2"/>
+      </w:pPr>
+      <w:r>
+        <w:t xml:space="preserve">15.1 Lista de verificação da declaração</w:t>
+      </w:r>
+    </w:p>
+    <w:p>
+      <w:pPr>
+        <w:numPr>
+          <w:ilvl w:val="0"/>
+          <w:numId w:val="1022"/>
+        </w:numPr>
+      </w:pPr>
+      <w:r>
+        <w:t xml:space="preserve">Quem é o dono e executa o controlo?</w:t>
+      </w:r>
+    </w:p>
+    <w:p>
+      <w:pPr>
+        <w:numPr>
+          <w:ilvl w:val="0"/>
+          <w:numId w:val="1022"/>
+        </w:numPr>
+      </w:pPr>
+      <w:r>
+        <w:t xml:space="preserve">Que sistemas, contas, dados, instalações, fornecedores e população estão cobertos?</w:t>
+      </w:r>
+    </w:p>
+    <w:p>
+      <w:pPr>
+        <w:numPr>
+          <w:ilvl w:val="0"/>
+          <w:numId w:val="1022"/>
+        </w:numPr>
+      </w:pPr>
+      <w:r>
+        <w:t xml:space="preserve">Que processo, configuração, ferramenta, regra e parâmetro o implementa?</w:t>
+      </w:r>
+    </w:p>
+    <w:p>
+      <w:pPr>
+        <w:numPr>
+          <w:ilvl w:val="0"/>
+          <w:numId w:val="1022"/>
+        </w:numPr>
+      </w:pPr>
+      <w:r>
+        <w:t xml:space="preserve">Onde é que ele opera e onde estão as provas?</w:t>
+      </w:r>
+    </w:p>
+    <w:p>
+      <w:pPr>
+        <w:numPr>
+          <w:ilvl w:val="0"/>
+          <w:numId w:val="1022"/>
+        </w:numPr>
+      </w:pPr>
+      <w:r>
+        <w:t xml:space="preserve">Quando/frequência/gatilho e quão rápido?</w:t>
+      </w:r>
+    </w:p>
+    <w:p>
+      <w:pPr>
+        <w:numPr>
+          <w:ilvl w:val="0"/>
+          <w:numId w:val="1022"/>
+        </w:numPr>
+      </w:pPr>
+      <w:r>
+        <w:t xml:space="preserve">Como aprovações, exceções, falhas, revisões, métricas, alterações e retestes são gerenciados?</w:t>
+      </w:r>
+    </w:p>
+    <w:p>
+      <w:pPr>
+        <w:numPr>
+          <w:ilvl w:val="0"/>
+          <w:numId w:val="1022"/>
+        </w:numPr>
+      </w:pPr>
+      <w:r>
+        <w:t xml:space="preserve">Que parte é herdada, partilhada, planeada, não aplicável ou ainda não opera?</w:t>
+      </w:r>
+    </w:p>
+    <w:bookmarkEnd w:id="71"/>
+    <w:bookmarkEnd w:id="72"/>
+    <w:bookmarkStart w:id="77" w:name="planejamento-de-avaliação-e-evidência"/>
+    <w:p>
+      <w:pPr>
+        <w:pStyle w:val="Heading1"/>
+      </w:pPr>
+      <w:r>
+        <w:t xml:space="preserve">16. Planejamento de Avaliação e Evidência</w:t>
+      </w:r>
+    </w:p>
+    <w:p>
+      <w:pPr>
+        <w:numPr>
+          <w:ilvl w:val="0"/>
+          <w:numId w:val="1023"/>
+        </w:numPr>
+        <w:pStyle w:val="Compact"/>
+      </w:pPr>
+      <w:r>
+        <w:t xml:space="preserve">Os procedimentos SP 800-53A são personalizados em um plano de avaliação aprovado.*</w:t>
+      </w:r>
+    </w:p>
+    <w:p>
+      <w:pPr>
+        <w:pStyle w:val="CaptionedFigure"/>
+      </w:pPr>
+      <w:r>
+        <w:drawing>
+          <wp:inline>
+            <wp:extent cx="5334000" cy="2945449"/>
+            <wp:effectExtent b="0" l="0" r="0" t="0"/>
+            <wp:docPr descr="Métodos, objetos, profundidade e cobertura devem se adequar ao objetivo e risco." title="" id="74" name="Picture"/>
+            <a:graphic>
+              <a:graphicData uri="http://schemas.openxmlformats.org/drawingml/2006/picture">
+                <pic:pic>
+                  <pic:nvPicPr>
+                    <pic:cNvPr descr="media/image7.png" id="75" name="Picture"/>
+                    <pic:cNvPicPr>
+                      <a:picLocks noChangeArrowheads="1" noChangeAspect="1"/>
+                    </pic:cNvPicPr>
+                  </pic:nvPicPr>
+                  <pic:blipFill>
+                    <a:blip r:embed="rId73"/>
+                    <a:stretch>
+                      <a:fillRect/>
+                    </a:stretch>
+                  </pic:blipFill>
+                  <pic:spPr bwMode="auto">
+                    <a:xfrm>
+                      <a:off x="0" y="0"/>
+                      <a:ext cx="5334000" cy="2945449"/>
+                    </a:xfrm>
+                    <a:prstGeom prst="rect">
+                      <a:avLst/>
+                    </a:prstGeom>
+                    <a:noFill/>
+                    <a:ln w="9525">
+                      <a:noFill/>
+                      <a:headEnd/>
+                      <a:tailEnd/>
+                    </a:ln>
+                  </pic:spPr>
+                </pic:pic>
+              </a:graphicData>
+            </a:graphic>
+          </wp:inline>
+        </w:drawing>
+      </w:r>
+    </w:p>
+    <w:p>
+      <w:pPr>
+        <w:pStyle w:val="ImageCaption"/>
+      </w:pPr>
+      <w:r>
+        <w:t xml:space="preserve">Métodos, objetos, profundidade e cobertura devem se adequar ao objetivo e risco.</w:t>
+      </w:r>
+    </w:p>
+    <w:p>
+      <w:pPr>
+        <w:pStyle w:val="BodyText"/>
+      </w:pPr>
+      <w:r>
+        <w:t xml:space="preserve">Figura 6. Estrutura do procedimento de avaliação</w:t>
+      </w:r>
+    </w:p>
+    <w:bookmarkStart w:id="76" w:name="section"/>
+    <w:p>
+      <w:pPr>
+        <w:pStyle w:val="Heading2"/>
+      </w:pPr>
+      <w:r>
+        <w:t xml:space="preserve">. . . . . . . . . .</w:t>
+      </w:r>
+    </w:p>
+    <w:p>
+      <w:pPr>
         <w:pStyle w:val="FirstParagraph"/>
       </w:pPr>
-    </w:p>
-    <w:p>
-      <w:pPr>
-        <w:pStyle w:val="BodyText"/>
-      </w:pPr>
-      <w:r>
-        <w:t xml:space="preserve">Figura 5. Anatomia de controle</w:t>
-      </w:r>
-    </w:p>
-    <w:p>
-      <w:pPr>
-        <w:numPr>
-          <w:ilvl w:val="0"/>
-          <w:numId w:val="1021"/>
-        </w:numPr>
-        <w:pStyle w:val="Heading2"/>
-      </w:pPr>
-      <w:bookmarkStart w:id="52" w:name="Xedc10af444e551c1fab18e313a051886c486d42"/>
-      <w:r>
-        <w:t xml:space="preserve">Declaração fraca** ** Padrão de instrução de Stronger**</w:t>
-      </w:r>
-      <w:bookmarkEnd w:id="52"/>
-    </w:p>
-    <w:p>
-      <w:pPr>
-        <w:numPr>
-          <w:ilvl w:val="0"/>
-          <w:numId w:val="1000"/>
-        </w:numPr>
-        <w:pStyle w:val="Compact"/>
-      </w:pPr>
-      <w:r>
-        <w:t xml:space="preserve">A organização usa o MFA. A equipe de identidade requer MFA resistente a phishing para funções de administrador nomeadas através do serviço de identidade aprovado; inscrições, exceções e revisão trimestral de cobertura são registradas em sistemas especificados. □</w:t>
-      </w:r>
-      <w:r>
-        <w:t xml:space="preserve"> </w:t>
-      </w:r>
-      <w:r>
-        <w:t xml:space="preserve">Os logs são revisados. As revisões de operações de segurança definiram eventos de alto risco continuamente através do SIEM e realizam revisão diária documentada de logons administrativos fracassados; os casos e exceções são mantidos para o período aprovado.</w:t>
-      </w:r>
-      <w:r>
-        <w:t xml:space="preserve"> </w:t>
-      </w:r>
-      <w:r>
-        <w:t xml:space="preserve">Os backups são realizados. As operações criam backups diários criptografados dos bancos de dados Tier 1 listados, mantém uma cópia isolada, monitora falhas e executa testes de restauração trimestrais contra RTO de quatro horas e RPO de 30 minutos.</w:t>
-      </w:r>
-    </w:p>
-    <w:bookmarkStart w:id="53" w:name="lista-de-verificação-da-declaração"/>
-    <w:p>
-      <w:pPr>
-        <w:pStyle w:val="Heading2"/>
-      </w:pPr>
-      <w:r>
-        <w:t xml:space="preserve">15.1 Lista de verificação da declaração</w:t>
-      </w:r>
-    </w:p>
-    <w:p>
-      <w:pPr>
-        <w:numPr>
-          <w:ilvl w:val="0"/>
-          <w:numId w:val="1022"/>
-        </w:numPr>
-      </w:pPr>
-      <w:r>
-        <w:t xml:space="preserve">Quem é o dono e executa o controlo?</w:t>
-      </w:r>
-    </w:p>
-    <w:p>
-      <w:pPr>
-        <w:numPr>
-          <w:ilvl w:val="0"/>
-          <w:numId w:val="1022"/>
-        </w:numPr>
-      </w:pPr>
-      <w:r>
-        <w:t xml:space="preserve">Que sistemas, contas, dados, instalações, fornecedores e população estão cobertos?</w:t>
-      </w:r>
-    </w:p>
-    <w:p>
-      <w:pPr>
-        <w:numPr>
-          <w:ilvl w:val="0"/>
-          <w:numId w:val="1022"/>
-        </w:numPr>
-      </w:pPr>
-      <w:r>
-        <w:t xml:space="preserve">Que processo, configuração, ferramenta, regra e parâmetro o implementa?</w:t>
-      </w:r>
-    </w:p>
-    <w:p>
-      <w:pPr>
-        <w:numPr>
-          <w:ilvl w:val="0"/>
-          <w:numId w:val="1022"/>
-        </w:numPr>
-      </w:pPr>
-      <w:r>
-        <w:t xml:space="preserve">Onde é que ele opera e onde estão as provas?</w:t>
-      </w:r>
-    </w:p>
-    <w:p>
-      <w:pPr>
-        <w:numPr>
-          <w:ilvl w:val="0"/>
-          <w:numId w:val="1022"/>
-        </w:numPr>
-      </w:pPr>
-      <w:r>
-        <w:t xml:space="preserve">Quando/frequência/gatilho e quão rápido?</w:t>
-      </w:r>
-    </w:p>
-    <w:p>
-      <w:pPr>
-        <w:numPr>
-          <w:ilvl w:val="0"/>
-          <w:numId w:val="1022"/>
-        </w:numPr>
-      </w:pPr>
-      <w:r>
-        <w:t xml:space="preserve">Como aprovações, exceções, falhas, revisões, métricas, alterações e retestes são gerenciados?</w:t>
-      </w:r>
-    </w:p>
-    <w:p>
-      <w:pPr>
-        <w:numPr>
-          <w:ilvl w:val="0"/>
-          <w:numId w:val="1022"/>
-        </w:numPr>
-      </w:pPr>
-      <w:r>
-        <w:t xml:space="preserve">Que parte é herdada, partilhada, planeada, não aplicável ou ainda não opera?</w:t>
-      </w:r>
-    </w:p>
-    <w:bookmarkEnd w:id="53"/>
-    <w:bookmarkEnd w:id="54"/>
-    <w:bookmarkStart w:id="56" w:name="planejamento-de-avaliação-e-evidência"/>
+      <w:r>
+        <w:t xml:space="preserve">O objectivo de avaliação é a determinação que o procedimento é concebido para apoiar</w:t>
+      </w:r>
+      <w:r>
+        <w:t xml:space="preserve"> </w:t>
+      </w:r>
+      <w:r>
+        <w:t xml:space="preserve">□ Método • Examinar, entrevistar ou testar</w:t>
+      </w:r>
+      <w:r>
+        <w:t xml:space="preserve"> </w:t>
+      </w:r>
+      <w:r>
+        <w:t xml:space="preserve">□ Objeto □ Especificação, mecanismo, atividade, individual, ou evidência examinada</w:t>
+      </w:r>
+      <w:r>
+        <w:t xml:space="preserve"> </w:t>
+      </w:r>
+      <w:r>
+        <w:t xml:space="preserve">Nível de rigor/detalhes: básico, focado ou abrangente</w:t>
+      </w:r>
+      <w:r>
+        <w:t xml:space="preserve"> </w:t>
+      </w:r>
+      <w:r>
+        <w:t xml:space="preserve">Cobertura ou escopo: básico, focado ou abrangente</w:t>
+      </w:r>
+      <w:r>
+        <w:t xml:space="preserve"> </w:t>
+      </w:r>
+      <w:r>
+        <w:t xml:space="preserve">□ Evidência □ Informação fiável que apoia a determinação</w:t>
+      </w:r>
+      <w:r>
+        <w:t xml:space="preserve"> </w:t>
+      </w:r>
+      <w:r>
+        <w:t xml:space="preserve">Resultado Satisfeito ou não satisfeito, com exceções e limitações</w:t>
+      </w:r>
+    </w:p>
+    <w:bookmarkEnd w:id="76"/>
+    <w:bookmarkEnd w:id="77"/>
+    <w:bookmarkStart w:id="78" w:name="população-e-amostragem"/>
     <w:p>
       <w:pPr>
         <w:pStyle w:val="Heading1"/>
       </w:pPr>
       <w:r>
-        <w:t xml:space="preserve">16. Planejamento de Avaliação e Evidência</w:t>
-      </w:r>
-    </w:p>
-    <w:p>
-      <w:pPr>
-        <w:numPr>
-          <w:ilvl w:val="0"/>
-          <w:numId w:val="1023"/>
-        </w:numPr>
-        <w:pStyle w:val="Compact"/>
-      </w:pPr>
-      <w:r>
-        <w:t xml:space="preserve">Os procedimentos SP 800-53A são personalizados em um plano de avaliação aprovado.*</w:t>
-      </w:r>
-    </w:p>
-    <w:p>
-      <w:pPr>
-        <w:pStyle w:val="FirstParagraph"/>
-      </w:pPr>
-    </w:p>
-    <w:p>
-      <w:pPr>
-        <w:pStyle w:val="BodyText"/>
-      </w:pPr>
-      <w:r>
-        <w:t xml:space="preserve">Figura 6. Estrutura do procedimento de avaliação</w:t>
-      </w:r>
-    </w:p>
-    <w:bookmarkStart w:id="55" w:name="section"/>
-    <w:p>
-      <w:pPr>
-        <w:pStyle w:val="Heading2"/>
-      </w:pPr>
-      <w:r>
-        <w:t xml:space="preserve">. . . . . . . . . .</w:t>
-      </w:r>
-    </w:p>
-    <w:p>
-      <w:pPr>
-        <w:pStyle w:val="FirstParagraph"/>
-      </w:pPr>
-      <w:r>
-        <w:t xml:space="preserve">O objectivo de avaliação é a determinação que o procedimento é concebido para apoiar</w:t>
-      </w:r>
-      <w:r>
-        <w:t xml:space="preserve"> </w:t>
-      </w:r>
-      <w:r>
-        <w:t xml:space="preserve">□ Método • Examinar, entrevistar ou testar</w:t>
-      </w:r>
-      <w:r>
-        <w:t xml:space="preserve"> </w:t>
-      </w:r>
-      <w:r>
-        <w:t xml:space="preserve">□ Objeto □ Especificação, mecanismo, atividade, individual, ou evidência examinada</w:t>
-      </w:r>
-      <w:r>
-        <w:t xml:space="preserve"> </w:t>
-      </w:r>
-      <w:r>
-        <w:t xml:space="preserve">Nível de rigor/detalhes: básico, focado ou abrangente</w:t>
-      </w:r>
-      <w:r>
-        <w:t xml:space="preserve"> </w:t>
-      </w:r>
-      <w:r>
-        <w:t xml:space="preserve">Cobertura ou escopo: básico, focado ou abrangente</w:t>
-      </w:r>
-      <w:r>
-        <w:t xml:space="preserve"> </w:t>
-      </w:r>
-      <w:r>
-        <w:t xml:space="preserve">□ Evidência □ Informação fiável que apoia a determinação</w:t>
-      </w:r>
-      <w:r>
-        <w:t xml:space="preserve"> </w:t>
-      </w:r>
-      <w:r>
-        <w:t xml:space="preserve">Resultado Satisfeito ou não satisfeito, com exceções e limitações</w:t>
-      </w:r>
-    </w:p>
-    <w:bookmarkEnd w:id="55"/>
-    <w:bookmarkEnd w:id="56"/>
-    <w:bookmarkStart w:id="57" w:name="população-e-amostragem"/>
-    <w:p>
-      <w:pPr>
-        <w:pStyle w:val="Heading1"/>
-      </w:pPr>
-      <w:r>
         <w:t xml:space="preserve">16.1 População e amostragem</w:t>
       </w:r>
     </w:p>
@@ -3875,8 +4225,8 @@
         <w:t xml:space="preserve">Expandir testes quando exceções sugerem um padrão ou fraqueza da população.</w:t>
       </w:r>
     </w:p>
-    <w:bookmarkEnd w:id="57"/>
-    <w:bookmarkStart w:id="58" w:name="pacote-de-autorização-e-poam"/>
+    <w:bookmarkEnd w:id="78"/>
+    <w:bookmarkStart w:id="79" w:name="pacote-de-autorização-e-poam"/>
     <w:p>
       <w:pPr>
         <w:pStyle w:val="Heading1"/>
@@ -3897,8 +4247,8 @@
         <w:t xml:space="preserve">O pacote conta a história de risco do propósito do sistema para abrir fraqueza e monitoramento.</w:t>
       </w:r>
     </w:p>
-    <w:bookmarkEnd w:id="58"/>
-    <w:bookmarkStart w:id="59" w:name="qualidade-de-poam"/>
+    <w:bookmarkEnd w:id="79"/>
+    <w:bookmarkStart w:id="80" w:name="qualidade-de-poam"/>
     <w:p>
       <w:pPr>
         <w:pStyle w:val="Heading1"/>
@@ -4129,8 +4479,8 @@
         <w:t xml:space="preserve"> </w:t>
       </w:r>
     </w:p>
-    <w:bookmarkEnd w:id="59"/>
-    <w:bookmarkStart w:id="61" w:name="estratégia-de-monitoramento-contínuo"/>
+    <w:bookmarkEnd w:id="80"/>
+    <w:bookmarkStart w:id="85" w:name="estratégia-de-monitoramento-contínuo"/>
     <w:p>
       <w:pPr>
         <w:pStyle w:val="Heading1"/>
@@ -4153,8 +4503,58 @@
     </w:p>
     <w:p>
       <w:pPr>
-        <w:pStyle w:val="BodyText"/>
-      </w:pPr>
+        <w:pStyle w:val="CaptionedFigure"/>
+      </w:pPr>
+      <w:r>
+        <w:drawing>
+          <wp:inline>
+            <wp:extent cx="5334000" cy="2945449"/>
+            <wp:effectExtent b="0" l="0" r="0" t="0"/>
+            <wp:docPr descr="Monitoramento fecha a alça da mudança e evidências para decisões de risco corrigidas." title="" id="82" name="Picture"/>
+            <a:graphic>
+              <a:graphicData uri="http://schemas.openxmlformats.org/drawingml/2006/picture">
+                <pic:pic>
+                  <pic:nvPicPr>
+                    <pic:cNvPr descr="media/image8.png" id="83" name="Picture"/>
+                    <pic:cNvPicPr>
+                      <a:picLocks noChangeArrowheads="1" noChangeAspect="1"/>
+                    </pic:cNvPicPr>
+                  </pic:nvPicPr>
+                  <pic:blipFill>
+                    <a:blip r:embed="rId81"/>
+                    <a:stretch>
+                      <a:fillRect/>
+                    </a:stretch>
+                  </pic:blipFill>
+                  <pic:spPr bwMode="auto">
+                    <a:xfrm>
+                      <a:off x="0" y="0"/>
+                      <a:ext cx="5334000" cy="2945449"/>
+                    </a:xfrm>
+                    <a:prstGeom prst="rect">
+                      <a:avLst/>
+                    </a:prstGeom>
+                    <a:noFill/>
+                    <a:ln w="9525">
+                      <a:noFill/>
+                      <a:headEnd/>
+                      <a:tailEnd/>
+                    </a:ln>
+                  </pic:spPr>
+                </pic:pic>
+              </a:graphicData>
+            </a:graphic>
+          </wp:inline>
+        </w:drawing>
+      </w:r>
+    </w:p>
+    <w:p>
+      <w:pPr>
+        <w:pStyle w:val="ImageCaption"/>
+      </w:pPr>
+      <w:r>
+        <w:t xml:space="preserve">Monitoramento fecha a alça da mudança e evidências para decisões de risco corrigidas.</w:t>
+      </w:r>
     </w:p>
     <w:p>
       <w:pPr>
@@ -4172,7 +4572,7 @@
         </w:numPr>
         <w:pStyle w:val="Heading2"/>
       </w:pPr>
-      <w:bookmarkStart w:id="60" w:name="campo-exemplo-conteúdo-de-decisão"/>
+      <w:bookmarkStart w:id="84" w:name="campo-exemplo-conteúdo-de-decisão"/>
       <w:r>
         <w:t xml:space="preserve">** Campo**</w:t>
       </w:r>
@@ -4186,7 +4586,7 @@
         </w:rPr>
         <w:t xml:space="preserve">Exemplo conteúdo de decisão</w:t>
       </w:r>
-      <w:bookmarkEnd w:id="60"/>
+      <w:bookmarkEnd w:id="84"/>
     </w:p>
     <w:p>
       <w:pPr>
@@ -4242,8 +4642,8 @@
         <w:t xml:space="preserve">• Retenção • Histórico obrigatório, proteção de evidências e atualização de pacotes</w:t>
       </w:r>
     </w:p>
-    <w:bookmarkEnd w:id="61"/>
-    <w:bookmarkStart w:id="64" w:name="oscal-e-automação"/>
+    <w:bookmarkEnd w:id="85"/>
+    <w:bookmarkStart w:id="91" w:name="oscal-e-automação"/>
     <w:p>
       <w:pPr>
         <w:pStyle w:val="Heading1"/>
@@ -4266,77 +4666,127 @@
     </w:p>
     <w:p>
       <w:pPr>
+        <w:pStyle w:val="CaptionedFigure"/>
+      </w:pPr>
+      <w:r>
+        <w:drawing>
+          <wp:inline>
+            <wp:extent cx="5334000" cy="2945449"/>
+            <wp:effectExtent b="0" l="0" r="0" t="0"/>
+            <wp:docPr descr="Modelos OSCAL conectam o que é necessário, como é implementado, como é avaliado e o que permanece aberto." title="" id="87" name="Picture"/>
+            <a:graphic>
+              <a:graphicData uri="http://schemas.openxmlformats.org/drawingml/2006/picture">
+                <pic:pic>
+                  <pic:nvPicPr>
+                    <pic:cNvPr descr="media/image9.png" id="88" name="Picture"/>
+                    <pic:cNvPicPr>
+                      <a:picLocks noChangeArrowheads="1" noChangeAspect="1"/>
+                    </pic:cNvPicPr>
+                  </pic:nvPicPr>
+                  <pic:blipFill>
+                    <a:blip r:embed="rId86"/>
+                    <a:stretch>
+                      <a:fillRect/>
+                    </a:stretch>
+                  </pic:blipFill>
+                  <pic:spPr bwMode="auto">
+                    <a:xfrm>
+                      <a:off x="0" y="0"/>
+                      <a:ext cx="5334000" cy="2945449"/>
+                    </a:xfrm>
+                    <a:prstGeom prst="rect">
+                      <a:avLst/>
+                    </a:prstGeom>
+                    <a:noFill/>
+                    <a:ln w="9525">
+                      <a:noFill/>
+                      <a:headEnd/>
+                      <a:tailEnd/>
+                    </a:ln>
+                  </pic:spPr>
+                </pic:pic>
+              </a:graphicData>
+            </a:graphic>
+          </wp:inline>
+        </w:drawing>
+      </w:r>
+    </w:p>
+    <w:p>
+      <w:pPr>
+        <w:pStyle w:val="ImageCaption"/>
+      </w:pPr>
+      <w:r>
+        <w:t xml:space="preserve">Modelos OSCAL conectam o que é necessário, como é implementado, como é avaliado e o que permanece aberto.</w:t>
+      </w:r>
+    </w:p>
+    <w:p>
+      <w:pPr>
+        <w:pStyle w:val="BodyText"/>
+      </w:pPr>
+      <w:r>
+        <w:t xml:space="preserve">Figura 9. Fluxo do modelo OSCAL</w:t>
+      </w:r>
+    </w:p>
+    <w:bookmarkStart w:id="89" w:name="modelo-oscal"/>
+    <w:p>
+      <w:pPr>
+        <w:pStyle w:val="Heading2"/>
+      </w:pPr>
+      <w:r>
+        <w:t xml:space="preserve">Modelo OSCAL**</w:t>
+      </w:r>
+    </w:p>
+    <w:p>
+      <w:pPr>
         <w:pStyle w:val="FirstParagraph"/>
       </w:pPr>
-    </w:p>
-    <w:p>
-      <w:pPr>
-        <w:pStyle w:val="BodyText"/>
-      </w:pPr>
-      <w:r>
-        <w:t xml:space="preserve">Figura 9. Fluxo do modelo OSCAL</w:t>
-      </w:r>
-    </w:p>
-    <w:bookmarkStart w:id="62" w:name="modelo-oscal"/>
+      <w:r>
+        <w:t xml:space="preserve">□ Catálogo □ Controles estruturados, melhorias, parâmetros e conteúdo de suporte</w:t>
+      </w:r>
+      <w:r>
+        <w:t xml:space="preserve"> </w:t>
+      </w:r>
+      <w:r>
+        <w:t xml:space="preserve">O perfil seleciona, modifica e organiza controles de catálogos</w:t>
+      </w:r>
+      <w:r>
+        <w:t xml:space="preserve"> </w:t>
+      </w:r>
+      <w:r>
+        <w:t xml:space="preserve">Definição de Componentes Descreve capacidades de implementação de controle reutilizáveis</w:t>
+      </w:r>
+      <w:r>
+        <w:t xml:space="preserve"> </w:t>
+      </w:r>
+      <w:r>
+        <w:t xml:space="preserve">Plano de segurança do sistema , descreve a implementação do sistema e controle ,</w:t>
+      </w:r>
+      <w:r>
+        <w:t xml:space="preserve"> </w:t>
+      </w:r>
+      <w:r>
+        <w:t xml:space="preserve">O Plano de Avaliação define o âmbito de avaliação, os assuntos, as tarefas, os métodos e o calendário</w:t>
+      </w:r>
+      <w:r>
+        <w:t xml:space="preserve"> </w:t>
+      </w:r>
+      <w:r>
+        <w:t xml:space="preserve">Resultados de avaliação , observações de registros, riscos, achados e resultados</w:t>
+      </w:r>
+      <w:r>
+        <w:t xml:space="preserve"> </w:t>
+      </w:r>
+      <w:r>
+        <w:t xml:space="preserve">Plano de Ação e Milestones Rastreia riscos, descobertas, ações, marcos e status</w:t>
+      </w:r>
+    </w:p>
+    <w:bookmarkEnd w:id="89"/>
+    <w:bookmarkStart w:id="90" w:name="salvaguardas-de-automação"/>
     <w:p>
       <w:pPr>
         <w:pStyle w:val="Heading2"/>
       </w:pPr>
       <w:r>
-        <w:t xml:space="preserve">Modelo OSCAL**</w:t>
-      </w:r>
-    </w:p>
-    <w:p>
-      <w:pPr>
-        <w:pStyle w:val="FirstParagraph"/>
-      </w:pPr>
-      <w:r>
-        <w:t xml:space="preserve">□ Catálogo □ Controles estruturados, melhorias, parâmetros e conteúdo de suporte</w:t>
-      </w:r>
-      <w:r>
-        <w:t xml:space="preserve"> </w:t>
-      </w:r>
-      <w:r>
-        <w:t xml:space="preserve">O perfil seleciona, modifica e organiza controles de catálogos</w:t>
-      </w:r>
-      <w:r>
-        <w:t xml:space="preserve"> </w:t>
-      </w:r>
-      <w:r>
-        <w:t xml:space="preserve">Definição de Componentes Descreve capacidades de implementação de controle reutilizáveis</w:t>
-      </w:r>
-      <w:r>
-        <w:t xml:space="preserve"> </w:t>
-      </w:r>
-      <w:r>
-        <w:t xml:space="preserve">Plano de segurança do sistema , descreve a implementação do sistema e controle ,</w:t>
-      </w:r>
-      <w:r>
-        <w:t xml:space="preserve"> </w:t>
-      </w:r>
-      <w:r>
-        <w:t xml:space="preserve">O Plano de Avaliação define o âmbito de avaliação, os assuntos, as tarefas, os métodos e o calendário</w:t>
-      </w:r>
-      <w:r>
-        <w:t xml:space="preserve"> </w:t>
-      </w:r>
-      <w:r>
-        <w:t xml:space="preserve">Resultados de avaliação , observações de registros, riscos, achados e resultados</w:t>
-      </w:r>
-      <w:r>
-        <w:t xml:space="preserve"> </w:t>
-      </w:r>
-      <w:r>
-        <w:t xml:space="preserve">Plano de Ação e Milestones Rastreia riscos, descobertas, ações, marcos e status</w:t>
-      </w:r>
-    </w:p>
-    <w:bookmarkEnd w:id="62"/>
-    <w:bookmarkStart w:id="63" w:name="salvaguardas-de-automação"/>
-    <w:p>
-      <w:pPr>
-        <w:pStyle w:val="Heading2"/>
-      </w:pPr>
-      <w:r>
         <w:t xml:space="preserve">19.1 Salvaguardas de automação</w:t>
       </w:r>
     </w:p>
@@ -4406,9 +4856,9 @@
         <w:t xml:space="preserve">Track versão, mudança, aprovação, transformação, herança, e histórico de exportação.</w:t>
       </w:r>
     </w:p>
-    <w:bookmarkEnd w:id="63"/>
-    <w:bookmarkEnd w:id="64"/>
-    <w:bookmarkStart w:id="65" w:name="X1bdda4098b02047a04942ba9d5d8d46b63e1df0"/>
+    <w:bookmarkEnd w:id="90"/>
+    <w:bookmarkEnd w:id="91"/>
+    <w:bookmarkStart w:id="92" w:name="X1bdda4098b02047a04942ba9d5d8d46b63e1df0"/>
     <w:p>
       <w:pPr>
         <w:pStyle w:val="Heading1"/>
@@ -4429,8 +4879,8 @@
         <w:t xml:space="preserve">Quatro famílias estabelecem quem pode agir, como as pessoas aprendem, o que é registrado, e como as decisões de garantia são tomadas.</w:t>
       </w:r>
     </w:p>
-    <w:bookmarkEnd w:id="65"/>
-    <w:bookmarkStart w:id="67" w:name="ac---controle-de-acesso"/>
+    <w:bookmarkEnd w:id="92"/>
+    <w:bookmarkStart w:id="94" w:name="ac---controle-de-acesso"/>
     <w:p>
       <w:pPr>
         <w:pStyle w:val="Heading1"/>
@@ -4447,7 +4897,7 @@
         <w:t xml:space="preserve">Limitar o acesso do sistema e da informação aos usuários, processos, dispositivos e ações autorizadas.</w:t>
       </w:r>
     </w:p>
-    <w:bookmarkStart w:id="66" w:name="X75c9709db5df1cf139ac48efb0ee456bab338f1"/>
+    <w:bookmarkStart w:id="93" w:name="X75c9709db5df1cf139ac48efb0ee456bab338f1"/>
     <w:p>
       <w:pPr>
         <w:pStyle w:val="Heading2"/>
@@ -4464,9 +4914,9 @@
         <w:t xml:space="preserve">□ Defina escopo, proprietário, requisitos, procedimentos, tecnologia, responsabilidades, exceções e monitoramento. Inventário da conta, funções, aprovações, MFA, regras de acesso, revisões, revogações, logs □ Combine evidência com o controle exato; valide população, data, configuração, operação, exceções e reteste.</w:t>
       </w:r>
     </w:p>
-    <w:bookmarkEnd w:id="66"/>
-    <w:bookmarkEnd w:id="67"/>
-    <w:bookmarkStart w:id="68" w:name="at-conscientização-e-treinamento"/>
+    <w:bookmarkEnd w:id="93"/>
+    <w:bookmarkEnd w:id="94"/>
+    <w:bookmarkStart w:id="95" w:name="at-conscientização-e-treinamento"/>
     <w:p>
       <w:pPr>
         <w:pStyle w:val="Heading1"/>
@@ -4550,8 +5000,8 @@
         </w:tc>
       </w:tr>
     </w:tbl>
-    <w:bookmarkEnd w:id="68"/>
-    <w:bookmarkStart w:id="69" w:name="ua-auditoria-e-responsabilidade"/>
+    <w:bookmarkEnd w:id="95"/>
+    <w:bookmarkStart w:id="96" w:name="ua-auditoria-e-responsabilidade"/>
     <w:p>
       <w:pPr>
         <w:pStyle w:val="Heading1"/>
@@ -4588,8 +5038,8 @@
         <w:t xml:space="preserve">□ Defina escopo, proprietário, requisitos, procedimentos, tecnologia, responsabilidades, exceções e monitoramento. □ Lista de eventos, fontes de log, sincronia de tempo, campos, retenção, acesso, revisão, alertas □ Coincidir evidência com o controle exato; validar população, data, configuração, operação, exceções e reteste.</w:t>
       </w:r>
     </w:p>
-    <w:bookmarkEnd w:id="69"/>
-    <w:bookmarkStart w:id="70" w:name="ca-avaliação-autorização-e-monitoramento"/>
+    <w:bookmarkEnd w:id="96"/>
+    <w:bookmarkStart w:id="97" w:name="ca-avaliação-autorização-e-monitoramento"/>
     <w:p>
       <w:pPr>
         <w:pStyle w:val="Heading1"/>
@@ -4626,8 +5076,8 @@
         <w:t xml:space="preserve">□ Defina escopo, proprietário, requisitos, procedimentos, tecnologia, responsabilidades, exceções e monitoramento. □ Planos de avaliação/relatórios, autorizações, POA&amp;M, estratégia de monitoramento, resultados □ Coincidir evidência com o controle exato; validar população, data, configuração, operação, exceções e reteste.</w:t>
       </w:r>
     </w:p>
-    <w:bookmarkEnd w:id="70"/>
-    <w:bookmarkStart w:id="71" w:name="X04602defaf169e85a7536bb16d3e5c3ffff860c"/>
+    <w:bookmarkEnd w:id="97"/>
+    <w:bookmarkStart w:id="98" w:name="X04602defaf169e85a7536bb16d3e5c3ffff860c"/>
     <w:p>
       <w:pPr>
         <w:pStyle w:val="Heading1"/>
@@ -4648,8 +5098,8 @@
         <w:t xml:space="preserve">Estas famílias garantem configuração, resiliência, identidade, resposta e manutenção controlada.</w:t>
       </w:r>
     </w:p>
-    <w:bookmarkEnd w:id="71"/>
-    <w:bookmarkStart w:id="72" w:name="cm---gestão-de-configuração"/>
+    <w:bookmarkEnd w:id="98"/>
+    <w:bookmarkStart w:id="99" w:name="cm---gestão-de-configuração"/>
     <w:p>
       <w:pPr>
         <w:pStyle w:val="Heading1"/>
@@ -4733,8 +5183,8 @@
         </w:tc>
       </w:tr>
     </w:tbl>
-    <w:bookmarkEnd w:id="72"/>
-    <w:bookmarkStart w:id="73" w:name="cp-planejamento-de-contingências"/>
+    <w:bookmarkEnd w:id="99"/>
+    <w:bookmarkStart w:id="100" w:name="cp-planejamento-de-contingências"/>
     <w:p>
       <w:pPr>
         <w:pStyle w:val="Heading1"/>
@@ -4771,8 +5221,8 @@
         <w:t xml:space="preserve">□ Defina escopo, proprietário, requisitos, procedimentos, tecnologia, responsabilidades, exceções e monitoramento. □ BIA, planos, backups, processamento alternativo, exercícios, restaurações, RTO/RPO □ Combine evidência com o controle exato; valide a população, data, configuração, operação, exceções e reteste.</w:t>
       </w:r>
     </w:p>
-    <w:bookmarkEnd w:id="73"/>
-    <w:bookmarkStart w:id="74" w:name="ia-identificação-e-autenticação"/>
+    <w:bookmarkEnd w:id="100"/>
+    <w:bookmarkStart w:id="101" w:name="ia-identificação-e-autenticação"/>
     <w:p>
       <w:pPr>
         <w:pStyle w:val="Heading1"/>
@@ -4856,8 +5306,8 @@
         </w:tc>
       </w:tr>
     </w:tbl>
-    <w:bookmarkEnd w:id="74"/>
-    <w:bookmarkStart w:id="75" w:name="ir-resposta-ao-incidente"/>
+    <w:bookmarkEnd w:id="101"/>
+    <w:bookmarkStart w:id="102" w:name="ir-resposta-ao-incidente"/>
     <w:p>
       <w:pPr>
         <w:pStyle w:val="Heading1"/>
@@ -4894,8 +5344,8 @@
         <w:t xml:space="preserve">□ Defina escopo, proprietário, requisitos, procedimentos, tecnologia, responsabilidades, exceções e monitoramento. O plano, funções, playbooks, casos, evidência, notificação, exercícios, lições, coincidir evidência para o controle exato; validar população, data, configuração, operação, exceções e reteste.</w:t>
       </w:r>
     </w:p>
-    <w:bookmarkEnd w:id="75"/>
-    <w:bookmarkStart w:id="76" w:name="ma-manutenção"/>
+    <w:bookmarkEnd w:id="102"/>
+    <w:bookmarkStart w:id="103" w:name="ma-manutenção"/>
     <w:p>
       <w:pPr>
         <w:pStyle w:val="Heading1"/>
@@ -4979,8 +5429,8 @@
         </w:tc>
       </w:tr>
     </w:tbl>
-    <w:bookmarkEnd w:id="76"/>
-    <w:bookmarkStart w:id="77" w:name="X77967bfea9749c327bdb3b958aa2c9c963b23e8"/>
+    <w:bookmarkEnd w:id="103"/>
+    <w:bookmarkStart w:id="104" w:name="X77967bfea9749c327bdb3b958aa2c9c963b23e8"/>
     <w:p>
       <w:pPr>
         <w:pStyle w:val="Heading1"/>
@@ -5001,8 +5451,8 @@
         <w:t xml:space="preserve">Estas famílias protegem a mídia, instalações, planos, programas e pessoal.*</w:t>
       </w:r>
     </w:p>
-    <w:bookmarkEnd w:id="77"/>
-    <w:bookmarkStart w:id="79" w:name="mp---proteção-de-mídia"/>
+    <w:bookmarkEnd w:id="104"/>
+    <w:bookmarkStart w:id="106" w:name="mp---proteção-de-mídia"/>
     <w:p>
       <w:pPr>
         <w:pStyle w:val="Heading1"/>
@@ -5019,7 +5469,7 @@
         <w:t xml:space="preserve">Proteger, controlar, transportar, higienizar e dispor de mídia digital e não digital.</w:t>
       </w:r>
     </w:p>
-    <w:bookmarkStart w:id="78" w:name="X5b04806af1b5b2a61e1d6db47b8e6bf9f90a056"/>
+    <w:bookmarkStart w:id="105" w:name="X5b04806af1b5b2a61e1d6db47b8e6bf9f90a056"/>
     <w:p>
       <w:pPr>
         <w:pStyle w:val="Heading2"/>
@@ -5036,9 +5486,9 @@
         <w:t xml:space="preserve">□ Defina escopo, proprietário, requisitos, procedimentos, tecnologia, responsabilidades, exceções e monitoramento. Inventário de mídia, acesso, marcação, transporte, criptografia, higienização, descarte; coincidir evidência com o controle exato; validar população, data, configuração, operação, exceções e reteste.</w:t>
       </w:r>
     </w:p>
-    <w:bookmarkEnd w:id="78"/>
-    <w:bookmarkEnd w:id="79"/>
-    <w:bookmarkStart w:id="80" w:name="pe-proteção-física-e-ambiental"/>
+    <w:bookmarkEnd w:id="105"/>
+    <w:bookmarkEnd w:id="106"/>
+    <w:bookmarkStart w:id="107" w:name="pe-proteção-física-e-ambiental"/>
     <w:p>
       <w:pPr>
         <w:pStyle w:val="Heading1"/>
@@ -5075,8 +5525,8 @@
         <w:t xml:space="preserve">□ Defina escopo, proprietário, requisitos, procedimentos, tecnologia, responsabilidades, exceções e monitoramento. Emblemas, visitantes, câmeras, alarmes, energia, fogo, temperatura, avaliações de instalação . Combine evidência com o controle exato; valide população, data, configuração, operação, exceções e reteste. .</w:t>
       </w:r>
     </w:p>
-    <w:bookmarkEnd w:id="80"/>
-    <w:bookmarkStart w:id="81" w:name="pl-planejamento"/>
+    <w:bookmarkEnd w:id="107"/>
+    <w:bookmarkStart w:id="108" w:name="pl-planejamento"/>
     <w:p>
       <w:pPr>
         <w:pStyle w:val="Heading1"/>
@@ -5160,8 +5610,8 @@
         </w:tc>
       </w:tr>
     </w:tbl>
-    <w:bookmarkEnd w:id="81"/>
-    <w:bookmarkStart w:id="83" w:name="pm-gestão-de-programas"/>
+    <w:bookmarkEnd w:id="108"/>
+    <w:bookmarkStart w:id="110" w:name="pm-gestão-de-programas"/>
     <w:p>
       <w:pPr>
         <w:pStyle w:val="Heading1"/>
@@ -5178,7 +5628,7 @@
         <w:t xml:space="preserve">Operar programas de segurança e privacidade de informação e governança compartilhada em toda a organização.</w:t>
       </w:r>
     </w:p>
-    <w:bookmarkStart w:id="82" w:name="X31e4f60035e1d687d188984e4b3f344972dafcf"/>
+    <w:bookmarkStart w:id="109" w:name="X31e4f60035e1d687d188984e4b3f344972dafcf"/>
     <w:p>
       <w:pPr>
         <w:pStyle w:val="Heading2"/>
@@ -5195,9 +5645,9 @@
         <w:t xml:space="preserve">□ Defina escopo, proprietário, requisitos, procedimentos, tecnologia, responsabilidades, exceções e monitoramento. Planos de programas, líderes, recursos, estratégia de risco, métricas, inventários corporativos, evidencie o controle exato; valide a população, data, configuração, operação, exceções e reteste.</w:t>
       </w:r>
     </w:p>
-    <w:bookmarkEnd w:id="82"/>
-    <w:bookmarkEnd w:id="83"/>
-    <w:bookmarkStart w:id="85" w:name="ps-segurança-do-pessoal"/>
+    <w:bookmarkEnd w:id="109"/>
+    <w:bookmarkEnd w:id="110"/>
+    <w:bookmarkStart w:id="112" w:name="ps-segurança-do-pessoal"/>
     <w:p>
       <w:pPr>
         <w:pStyle w:val="Heading1"/>
@@ -5214,7 +5664,7 @@
         <w:t xml:space="preserve">Gerencie rastreamento de pessoal, acordos, transferências, rescisão, sanções e risco.</w:t>
       </w:r>
     </w:p>
-    <w:bookmarkStart w:id="84" w:name="X27900b36e004a4355f3dd7d4dc787f3b4d0c425"/>
+    <w:bookmarkStart w:id="111" w:name="X27900b36e004a4355f3dd7d4dc787f3b4d0c425"/>
     <w:p>
       <w:pPr>
         <w:pStyle w:val="Heading2"/>
@@ -5231,9 +5681,9 @@
         <w:t xml:space="preserve">□ Defina escopo, proprietário, requisitos, procedimentos, tecnologia, responsabilidades, exceções e monitoramento. Rastreamento, acordos, mudanças de papel, término de acesso, pessoal de terceiros □ Combine evidência com o controle exato; valide população, data, configuração, operação, exceções e reteste.</w:t>
       </w:r>
     </w:p>
-    <w:bookmarkEnd w:id="84"/>
-    <w:bookmarkEnd w:id="85"/>
-    <w:bookmarkStart w:id="86" w:name="Xab8d233bcbda72c5112d5c3ad133edc506822c9"/>
+    <w:bookmarkEnd w:id="111"/>
+    <w:bookmarkEnd w:id="112"/>
+    <w:bookmarkStart w:id="113" w:name="Xab8d233bcbda72c5112d5c3ad133edc506822c9"/>
     <w:p>
       <w:pPr>
         <w:pStyle w:val="Heading1"/>
@@ -5254,8 +5704,8 @@
         <w:t xml:space="preserve">Essas famílias cobrem PII, risco, aquisição, arquitetura/comunicações, integridade e cadeias de suprimentos.*</w:t>
       </w:r>
     </w:p>
-    <w:bookmarkEnd w:id="86"/>
-    <w:bookmarkStart w:id="88" w:name="pt-processamento-e-transparência-pii"/>
+    <w:bookmarkEnd w:id="113"/>
+    <w:bookmarkStart w:id="115" w:name="pt-processamento-e-transparência-pii"/>
     <w:p>
       <w:pPr>
         <w:pStyle w:val="Heading1"/>
@@ -5339,7 +5789,7 @@
         </w:tc>
       </w:tr>
     </w:tbl>
-    <w:bookmarkStart w:id="87" w:name="ra-avaliação-de-risco"/>
+    <w:bookmarkStart w:id="114" w:name="ra-avaliação-de-risco"/>
     <w:p>
       <w:pPr>
         <w:pStyle w:val="Heading2"/>
@@ -5423,9 +5873,9 @@
         </w:tc>
       </w:tr>
     </w:tbl>
-    <w:bookmarkEnd w:id="87"/>
-    <w:bookmarkEnd w:id="88"/>
-    <w:bookmarkStart w:id="89" w:name="sa-aquisição-de-sistema-e-serviços"/>
+    <w:bookmarkEnd w:id="114"/>
+    <w:bookmarkEnd w:id="115"/>
+    <w:bookmarkStart w:id="116" w:name="sa-aquisição-de-sistema-e-serviços"/>
     <w:p>
       <w:pPr>
         <w:pStyle w:val="Heading1"/>
@@ -5462,8 +5912,8 @@
         <w:t xml:space="preserve">□ Defina escopo, proprietário, requisitos, procedimentos, tecnologia, responsabilidades, exceções e monitoramento. Os requisitos, contratos, SDLC, arquitetura, desenvolvedores, testes, SBOM, evidência do fornecedor, combinam evidências com o controle exato; valide população, data, configuração, operação, exceções e reteste.</w:t>
       </w:r>
     </w:p>
-    <w:bookmarkEnd w:id="89"/>
-    <w:bookmarkStart w:id="90" w:name="X14356835866b4ab53725db64848215c9859be90"/>
+    <w:bookmarkEnd w:id="116"/>
+    <w:bookmarkStart w:id="117" w:name="X14356835866b4ab53725db64848215c9859be90"/>
     <w:p>
       <w:pPr>
         <w:pStyle w:val="Heading1"/>
@@ -5547,8 +5997,8 @@
         </w:tc>
       </w:tr>
     </w:tbl>
-    <w:bookmarkEnd w:id="90"/>
-    <w:bookmarkStart w:id="91" w:name="Xe7f743a532c27365d8044ab426c81fe91938957"/>
+    <w:bookmarkEnd w:id="117"/>
+    <w:bookmarkStart w:id="118" w:name="Xe7f743a532c27365d8044ab426c81fe91938957"/>
     <w:p>
       <w:pPr>
         <w:pStyle w:val="Heading1"/>
@@ -5585,8 +6035,8 @@
         <w:t xml:space="preserve">□ Defina escopo, proprietário, requisitos, procedimentos, tecnologia, responsabilidades, exceções e monitoramento. Vulnerabilidades, patches, validação de integridade, defesas de malware, alertas, correções □ Combine evidência com o controle exato; valide população, data, configuração, operação, exceções e reteste.</w:t>
       </w:r>
     </w:p>
-    <w:bookmarkEnd w:id="91"/>
-    <w:bookmarkStart w:id="92" w:name="Xaf95043c8b1039d08e5b0140515065733238b2c"/>
+    <w:bookmarkEnd w:id="118"/>
+    <w:bookmarkStart w:id="119" w:name="Xaf95043c8b1039d08e5b0140515065733238b2c"/>
     <w:p>
       <w:pPr>
         <w:pStyle w:val="Heading1"/>
@@ -5623,8 +6073,8 @@
         <w:t xml:space="preserve">□ Defina escopo, proprietário, requisitos, procedimentos, tecnologia, responsabilidades, exceções e monitoramento. O plano C-SCRM, inventário do fornecedor, criticidade, contratos, procedência, monitoramento, saída, coincidir evidência com o controle exato; validar população, data, configuração, operação, exceções e reteste.</w:t>
       </w:r>
     </w:p>
-    <w:bookmarkEnd w:id="92"/>
-    <w:bookmarkStart w:id="93" w:name="Xf712b4878a72cab38b1b33fbe4a4bfd270c7db3"/>
+    <w:bookmarkEnd w:id="119"/>
+    <w:bookmarkStart w:id="120" w:name="Xf712b4878a72cab38b1b33fbe4a4bfd270c7db3"/>
     <w:p>
       <w:pPr>
         <w:pStyle w:val="Heading1"/>
@@ -5645,8 +6095,8 @@
         <w:t xml:space="preserve">Rev. 5 integra controles de segurança e privacidade, preservando objetivos distintos e métodos de risco.</w:t>
       </w:r>
     </w:p>
-    <w:bookmarkEnd w:id="93"/>
-    <w:bookmarkStart w:id="95" w:name="colaboração"/>
+    <w:bookmarkEnd w:id="120"/>
+    <w:bookmarkStart w:id="122" w:name="colaboração"/>
     <w:p>
       <w:pPr>
         <w:pStyle w:val="Heading1"/>
@@ -5710,7 +6160,7 @@
         <w:t xml:space="preserve">Privacy baseline seleção e alfaiataria dependem do processamento, finalidade, autoridade, pessoas, dados, contexto e risco de privacidade – não apenas impacto FIPS.</w:t>
       </w:r>
     </w:p>
-    <w:bookmarkStart w:id="94" w:name="pergunta-pergunta-exemplo-de-artefato"/>
+    <w:bookmarkStart w:id="121" w:name="pergunta-pergunta-exemplo-de-artefato"/>
     <w:p>
       <w:pPr>
         <w:pStyle w:val="Heading2"/>
@@ -5751,9 +6201,9 @@
         <w:t xml:space="preserve">Como os controles de segurança e privacidade são coordenados? Índice de colaboração, alocações, provas conjuntas e conclusões</w:t>
       </w:r>
     </w:p>
-    <w:bookmarkEnd w:id="94"/>
-    <w:bookmarkEnd w:id="95"/>
-    <w:bookmarkStart w:id="97" w:name="X84fa6ee8b9ced642623b9cb4466bb2dcdbead29"/>
+    <w:bookmarkEnd w:id="121"/>
+    <w:bookmarkEnd w:id="122"/>
+    <w:bookmarkStart w:id="124" w:name="X84fa6ee8b9ced642623b9cb4466bb2dcdbead29"/>
     <w:p>
       <w:pPr>
         <w:pStyle w:val="Heading1"/>
@@ -5846,7 +6296,7 @@
         <w:t xml:space="preserve">SP 800-53B 5.2.0 □ Reemitido para consistência; NIST declara que as selecções de base não alteraram</w:t>
       </w:r>
     </w:p>
-    <w:bookmarkStart w:id="96" w:name="foco-em-evidência"/>
+    <w:bookmarkStart w:id="123" w:name="foco-em-evidência"/>
     <w:p>
       <w:pPr>
         <w:pStyle w:val="Heading2"/>
@@ -5888,9 +6338,9 @@
         <w:t xml:space="preserve">Suposições de projeto resilientes, comportamento de condições adversas, isolamento, degradação, recuperação, diversidade, redundância e resultados de exercício.</w:t>
       </w:r>
     </w:p>
-    <w:bookmarkEnd w:id="96"/>
-    <w:bookmarkEnd w:id="97"/>
-    <w:bookmarkStart w:id="99" w:name="X96eea5e622fd0d2d97110f1743b80368ca6b94f"/>
+    <w:bookmarkEnd w:id="123"/>
+    <w:bookmarkEnd w:id="124"/>
+    <w:bookmarkStart w:id="126" w:name="X96eea5e622fd0d2d97110f1743b80368ca6b94f"/>
     <w:p>
       <w:pPr>
         <w:pStyle w:val="Heading1"/>
@@ -5911,7 +6361,7 @@
         <w:t xml:space="preserve">Recursos oficiais e ferramentas de código aberto podem apoiar a autoria, evidência, avaliação e monitoramento contínuo.</w:t>
       </w:r>
     </w:p>
-    <w:bookmarkStart w:id="98" w:name="recurso-ferramenta-purpose"/>
+    <w:bookmarkStart w:id="125" w:name="recurso-ferramenta-purpose"/>
     <w:p>
       <w:pPr>
         <w:pStyle w:val="Heading2"/>
@@ -6054,9 +6504,9 @@
         <w:t xml:space="preserve">□————————————————————————————————————————————————————————————————————————————————————————————————————————————————————————————————</w:t>
       </w:r>
     </w:p>
-    <w:bookmarkEnd w:id="98"/>
-    <w:bookmarkEnd w:id="99"/>
-    <w:bookmarkStart w:id="101" w:name="nist-cprt"/>
+    <w:bookmarkEnd w:id="125"/>
+    <w:bookmarkEnd w:id="126"/>
+    <w:bookmarkStart w:id="128" w:name="nist-cprt"/>
     <w:p>
       <w:pPr>
         <w:pStyle w:val="Heading1"/>
@@ -6075,7 +6525,7 @@
       <w:r>
         <w:t xml:space="preserve"> </w:t>
       </w:r>
-      <w:hyperlink r:id="rId100">
+      <w:hyperlink r:id="rId127">
         <w:r>
           <w:rPr>
             <w:rStyle w:val="Hyperlink"/>
@@ -6100,8 +6550,8 @@
         <w:t xml:space="preserve">Reter: autoridade, escopo, fonte/lançamento, versão, configuração/consulta, população, data, resultado bruto, validação do analista, limitação, mapeamento de controle, achado, correção e reteste. Proteger as informações do sistema e da vulnerabilidade.</w:t>
       </w:r>
     </w:p>
-    <w:bookmarkEnd w:id="101"/>
-    <w:bookmarkStart w:id="103" w:name="nist-conteúdo-oscal"/>
+    <w:bookmarkEnd w:id="128"/>
+    <w:bookmarkStart w:id="130" w:name="nist-conteúdo-oscal"/>
     <w:p>
       <w:pPr>
         <w:pStyle w:val="Heading1"/>
@@ -6120,7 +6570,7 @@
       <w:r>
         <w:t xml:space="preserve"> </w:t>
       </w:r>
-      <w:hyperlink r:id="rId102">
+      <w:hyperlink r:id="rId129">
         <w:r>
           <w:rPr>
             <w:rStyle w:val="Hyperlink"/>
@@ -6145,8 +6595,8 @@
         <w:t xml:space="preserve">Reter: autoridade, escopo, fonte/lançamento, versão, configuração/consulta, população, data, resultado bruto, validação do analista, limitação, mapeamento de controle, achado, correção e reteste. Proteger as informações do sistema e da vulnerabilidade.</w:t>
       </w:r>
     </w:p>
-    <w:bookmarkEnd w:id="103"/>
-    <w:bookmarkStart w:id="105" w:name="compliance-trestle"/>
+    <w:bookmarkEnd w:id="130"/>
+    <w:bookmarkStart w:id="132" w:name="compliance-trestle"/>
     <w:p>
       <w:pPr>
         <w:pStyle w:val="Heading1"/>
@@ -6165,7 +6615,7 @@
       <w:r>
         <w:t xml:space="preserve"> </w:t>
       </w:r>
-      <w:hyperlink r:id="rId104">
+      <w:hyperlink r:id="rId131">
         <w:r>
           <w:rPr>
             <w:rStyle w:val="Hyperlink"/>
@@ -6190,8 +6640,8 @@
         <w:t xml:space="preserve">Reter: autoridade, escopo, fonte/lançamento, versão, configuração/consulta, população, data, resultado bruto, validação do analista, limitação, mapeamento de controle, achado, correção e reteste. Proteger as informações do sistema e da vulnerabilidade.</w:t>
       </w:r>
     </w:p>
-    <w:bookmarkEnd w:id="105"/>
-    <w:bookmarkStart w:id="107" w:name="lula"/>
+    <w:bookmarkEnd w:id="132"/>
+    <w:bookmarkStart w:id="134" w:name="lula"/>
     <w:p>
       <w:pPr>
         <w:pStyle w:val="Heading1"/>
@@ -6210,7 +6660,7 @@
       <w:r>
         <w:t xml:space="preserve"> </w:t>
       </w:r>
-      <w:hyperlink r:id="rId106">
+      <w:hyperlink r:id="rId133">
         <w:r>
           <w:rPr>
             <w:rStyle w:val="Hyperlink"/>
@@ -6235,8 +6685,8 @@
         <w:t xml:space="preserve">Reter: autoridade, escopo, fonte/lançamento, versão, configuração/consulta, população, data, resultado bruto, validação do analista, limitação, mapeamento de controle, achado, correção e reteste. Proteger as informações do sistema e da vulnerabilidade.</w:t>
       </w:r>
     </w:p>
-    <w:bookmarkEnd w:id="107"/>
-    <w:bookmarkStart w:id="109" w:name="assistente-ciso"/>
+    <w:bookmarkEnd w:id="134"/>
+    <w:bookmarkStart w:id="136" w:name="assistente-ciso"/>
     <w:p>
       <w:pPr>
         <w:pStyle w:val="Heading1"/>
@@ -6255,7 +6705,7 @@
       <w:r>
         <w:t xml:space="preserve"> </w:t>
       </w:r>
-      <w:hyperlink r:id="rId108">
+      <w:hyperlink r:id="rId135">
         <w:r>
           <w:rPr>
             <w:rStyle w:val="Hyperlink"/>
@@ -6280,8 +6730,8 @@
         <w:t xml:space="preserve">Reter: autoridade, escopo, fonte/lançamento, versão, configuração/consulta, população, data, resultado bruto, validação do analista, limitação, mapeamento de controle, achado, correção e reteste. Proteger as informações do sistema e da vulnerabilidade.</w:t>
       </w:r>
     </w:p>
-    <w:bookmarkEnd w:id="109"/>
-    <w:bookmarkStart w:id="111" w:name="heimdall"/>
+    <w:bookmarkEnd w:id="136"/>
+    <w:bookmarkStart w:id="138" w:name="heimdall"/>
     <w:p>
       <w:pPr>
         <w:pStyle w:val="Heading1"/>
@@ -6300,7 +6750,7 @@
       <w:r>
         <w:t xml:space="preserve"> </w:t>
       </w:r>
-      <w:hyperlink r:id="rId110">
+      <w:hyperlink r:id="rId137">
         <w:r>
           <w:rPr>
             <w:rStyle w:val="Hyperlink"/>
@@ -6325,8 +6775,8 @@
         <w:t xml:space="preserve">Reter: autoridade, escopo, fonte/lançamento, versão, configuração/consulta, população, data, resultado bruto, validação do analista, limitação, mapeamento de controle, achado, correção e reteste. Proteger as informações do sistema e da vulnerabilidade.</w:t>
       </w:r>
     </w:p>
-    <w:bookmarkEnd w:id="111"/>
-    <w:bookmarkStart w:id="113" w:name="opencontrol"/>
+    <w:bookmarkEnd w:id="138"/>
+    <w:bookmarkStart w:id="140" w:name="opencontrol"/>
     <w:p>
       <w:pPr>
         <w:pStyle w:val="Heading1"/>
@@ -6345,7 +6795,7 @@
       <w:r>
         <w:t xml:space="preserve"> </w:t>
       </w:r>
-      <w:hyperlink r:id="rId112">
+      <w:hyperlink r:id="rId139">
         <w:r>
           <w:rPr>
             <w:rStyle w:val="Hyperlink"/>
@@ -6370,8 +6820,8 @@
         <w:t xml:space="preserve">Reter: autoridade, escopo, fonte/lançamento, versão, configuração/consulta, população, data, resultado bruto, validação do analista, limitação, mapeamento de controle, achado, correção e reteste. Proteger as informações do sistema e da vulnerabilidade.</w:t>
       </w:r>
     </w:p>
-    <w:bookmarkEnd w:id="113"/>
-    <w:bookmarkStart w:id="115" w:name="cli-oscal"/>
+    <w:bookmarkEnd w:id="140"/>
+    <w:bookmarkStart w:id="142" w:name="cli-oscal"/>
     <w:p>
       <w:pPr>
         <w:pStyle w:val="Heading1"/>
@@ -6390,7 +6840,7 @@
       <w:r>
         <w:t xml:space="preserve"> </w:t>
       </w:r>
-      <w:hyperlink r:id="rId114">
+      <w:hyperlink r:id="rId141">
         <w:r>
           <w:rPr>
             <w:rStyle w:val="Hyperlink"/>
@@ -6415,8 +6865,8 @@
         <w:t xml:space="preserve">Reter: autoridade, escopo, fonte/lançamento, versão, configuração/consulta, população, data, resultado bruto, validação do analista, limitação, mapeamento de controle, achado, correção e reteste. Proteger as informações do sistema e da vulnerabilidade.</w:t>
       </w:r>
     </w:p>
-    <w:bookmarkEnd w:id="115"/>
-    <w:bookmarkStart w:id="117" w:name="wazuh"/>
+    <w:bookmarkEnd w:id="142"/>
+    <w:bookmarkStart w:id="144" w:name="wazuh"/>
     <w:p>
       <w:pPr>
         <w:pStyle w:val="Heading1"/>
@@ -6435,7 +6885,7 @@
       <w:r>
         <w:t xml:space="preserve"> </w:t>
       </w:r>
-      <w:hyperlink r:id="rId116">
+      <w:hyperlink r:id="rId143">
         <w:r>
           <w:rPr>
             <w:rStyle w:val="Hyperlink"/>
@@ -6460,8 +6910,8 @@
         <w:t xml:space="preserve">Reter: autoridade, escopo, fonte/lançamento, versão, configuração/consulta, população, data, resultado bruto, validação do analista, limitação, mapeamento de controle, achado, correção e reteste. Proteger as informações do sistema e da vulnerabilidade.</w:t>
       </w:r>
     </w:p>
-    <w:bookmarkEnd w:id="117"/>
-    <w:bookmarkStart w:id="120" w:name="openscap"/>
+    <w:bookmarkEnd w:id="144"/>
+    <w:bookmarkStart w:id="147" w:name="openscap"/>
     <w:p>
       <w:pPr>
         <w:pStyle w:val="Heading1"/>
@@ -6480,7 +6930,7 @@
       <w:r>
         <w:t xml:space="preserve"> </w:t>
       </w:r>
-      <w:hyperlink r:id="rId118">
+      <w:hyperlink r:id="rId145">
         <w:r>
           <w:rPr>
             <w:rStyle w:val="Hyperlink"/>
@@ -6523,7 +6973,7 @@
       <w:r>
         <w:t xml:space="preserve"> </w:t>
       </w:r>
-      <w:hyperlink r:id="rId119">
+      <w:hyperlink r:id="rId146">
         <w:r>
           <w:rPr>
             <w:rStyle w:val="Hyperlink"/>
@@ -6548,8 +6998,8 @@
         <w:t xml:space="preserve">Reter: autoridade, escopo, fonte/lançamento, versão, configuração/consulta, população, data, resultado bruto, validação do analista, limitação, mapeamento de controle, achado, correção e reteste. Proteger as informações do sistema e da vulnerabilidade.</w:t>
       </w:r>
     </w:p>
-    <w:bookmarkEnd w:id="120"/>
-    <w:bookmarkStart w:id="122" w:name="nmap"/>
+    <w:bookmarkEnd w:id="147"/>
+    <w:bookmarkStart w:id="149" w:name="nmap"/>
     <w:p>
       <w:pPr>
         <w:pStyle w:val="Heading1"/>
@@ -6568,7 +7018,7 @@
       <w:r>
         <w:t xml:space="preserve"> </w:t>
       </w:r>
-      <w:hyperlink r:id="rId121">
+      <w:hyperlink r:id="rId148">
         <w:r>
           <w:rPr>
             <w:rStyle w:val="Hyperlink"/>
@@ -6593,8 +7043,8 @@
         <w:t xml:space="preserve">Reter: autoridade, escopo, fonte/lançamento, versão, configuração/consulta, população, data, resultado bruto, validação do analista, limitação, mapeamento de controle, achado, correção e reteste. Proteger as informações do sistema e da vulnerabilidade.</w:t>
       </w:r>
     </w:p>
-    <w:bookmarkEnd w:id="122"/>
-    <w:bookmarkStart w:id="124" w:name="greenbone-community-edition"/>
+    <w:bookmarkEnd w:id="149"/>
+    <w:bookmarkStart w:id="151" w:name="greenbone-community-edition"/>
     <w:p>
       <w:pPr>
         <w:pStyle w:val="Heading1"/>
@@ -6613,7 +7063,7 @@
       <w:r>
         <w:t xml:space="preserve"> </w:t>
       </w:r>
-      <w:hyperlink r:id="rId123">
+      <w:hyperlink r:id="rId150">
         <w:r>
           <w:rPr>
             <w:rStyle w:val="Hyperlink"/>
@@ -6638,8 +7088,8 @@
         <w:t xml:space="preserve">Reter: autoridade, escopo, fonte/lançamento, versão, configuração/consulta, população, data, resultado bruto, validação do analista, limitação, mapeamento de controle, achado, correção e reteste. Proteger as informações do sistema e da vulnerabilidade.</w:t>
       </w:r>
     </w:p>
-    <w:bookmarkEnd w:id="124"/>
-    <w:bookmarkStart w:id="126" w:name="trivy"/>
+    <w:bookmarkEnd w:id="151"/>
+    <w:bookmarkStart w:id="153" w:name="trivy"/>
     <w:p>
       <w:pPr>
         <w:pStyle w:val="Heading1"/>
@@ -6658,7 +7108,7 @@
       <w:r>
         <w:t xml:space="preserve"> </w:t>
       </w:r>
-      <w:hyperlink r:id="rId125">
+      <w:hyperlink r:id="rId152">
         <w:r>
           <w:rPr>
             <w:rStyle w:val="Hyperlink"/>
@@ -6683,8 +7133,8 @@
         <w:t xml:space="preserve">Reter: autoridade, escopo, fonte/lançamento, versão, configuração/consulta, população, data, resultado bruto, validação do analista, limitação, mapeamento de controle, achado, correção e reteste. Proteger as informações do sistema e da vulnerabilidade.</w:t>
       </w:r>
     </w:p>
-    <w:bookmarkEnd w:id="126"/>
-    <w:bookmarkStart w:id="128" w:name="owasp-zap"/>
+    <w:bookmarkEnd w:id="153"/>
+    <w:bookmarkStart w:id="155" w:name="owasp-zap"/>
     <w:p>
       <w:pPr>
         <w:pStyle w:val="Heading1"/>
@@ -6703,7 +7153,7 @@
       <w:r>
         <w:t xml:space="preserve"> </w:t>
       </w:r>
-      <w:hyperlink r:id="rId127">
+      <w:hyperlink r:id="rId154">
         <w:r>
           <w:rPr>
             <w:rStyle w:val="Hyperlink"/>
@@ -6728,8 +7178,8 @@
         <w:t xml:space="preserve">Reter: autoridade, escopo, fonte/lançamento, versão, configuração/consulta, população, data, resultado bruto, validação do analista, limitação, mapeamento de controle, achado, correção e reteste. Proteger as informações do sistema e da vulnerabilidade.</w:t>
       </w:r>
     </w:p>
-    <w:bookmarkEnd w:id="128"/>
-    <w:bookmarkStart w:id="130" w:name="keycloak"/>
+    <w:bookmarkEnd w:id="155"/>
+    <w:bookmarkStart w:id="157" w:name="keycloak"/>
     <w:p>
       <w:pPr>
         <w:pStyle w:val="Heading1"/>
@@ -6748,7 +7198,7 @@
       <w:r>
         <w:t xml:space="preserve"> </w:t>
       </w:r>
-      <w:hyperlink r:id="rId129">
+      <w:hyperlink r:id="rId156">
         <w:r>
           <w:rPr>
             <w:rStyle w:val="Hyperlink"/>
@@ -6773,8 +7223,8 @@
         <w:t xml:space="preserve">Reter: autoridade, escopo, fonte/lançamento, versão, configuração/consulta, população, data, resultado bruto, validação do analista, limitação, mapeamento de controle, achado, correção e reteste. Proteger as informações do sistema e da vulnerabilidade.</w:t>
       </w:r>
     </w:p>
-    <w:bookmarkEnd w:id="130"/>
-    <w:bookmarkStart w:id="132" w:name="defectdojo"/>
+    <w:bookmarkEnd w:id="157"/>
+    <w:bookmarkStart w:id="159" w:name="defectdojo"/>
     <w:p>
       <w:pPr>
         <w:pStyle w:val="Heading1"/>
@@ -6793,7 +7243,7 @@
       <w:r>
         <w:t xml:space="preserve"> </w:t>
       </w:r>
-      <w:hyperlink r:id="rId131">
+      <w:hyperlink r:id="rId158">
         <w:r>
           <w:rPr>
             <w:rStyle w:val="Hyperlink"/>
@@ -6818,8 +7268,8 @@
         <w:t xml:space="preserve">Reter: autoridade, escopo, fonte/lançamento, versão, configuração/consulta, população, data, resultado bruto, validação do analista, limitação, mapeamento de controle, achado, correção e reteste. Proteger as informações do sistema e da vulnerabilidade.</w:t>
       </w:r>
     </w:p>
-    <w:bookmarkEnd w:id="132"/>
-    <w:bookmarkStart w:id="134" w:name="open-policy-agent"/>
+    <w:bookmarkEnd w:id="159"/>
+    <w:bookmarkStart w:id="161" w:name="open-policy-agent"/>
     <w:p>
       <w:pPr>
         <w:pStyle w:val="Heading1"/>
@@ -6838,7 +7288,7 @@
       <w:r>
         <w:t xml:space="preserve"> </w:t>
       </w:r>
-      <w:hyperlink r:id="rId133">
+      <w:hyperlink r:id="rId160">
         <w:r>
           <w:rPr>
             <w:rStyle w:val="Hyperlink"/>
@@ -6863,8 +7313,8 @@
         <w:t xml:space="preserve">Reter: autoridade, escopo, fonte/lançamento, versão, configuração/consulta, população, data, resultado bruto, validação do analista, limitação, mapeamento de controle, achado, correção e reteste. Proteger as informações do sistema e da vulnerabilidade.</w:t>
       </w:r>
     </w:p>
-    <w:bookmarkEnd w:id="134"/>
-    <w:bookmarkStart w:id="137" w:name="manual-do-rmf-para-gerentes"/>
+    <w:bookmarkEnd w:id="161"/>
+    <w:bookmarkStart w:id="164" w:name="manual-do-rmf-para-gerentes"/>
     <w:p>
       <w:pPr>
         <w:pStyle w:val="Heading1"/>
@@ -6885,7 +7335,7 @@
         <w:t xml:space="preserve">Os gerentes mantêm RMF focado em risco de missão, evidências confiáveis, decisões oportunas e correção.*</w:t>
       </w:r>
     </w:p>
-    <w:bookmarkStart w:id="135" w:name="section-1"/>
+    <w:bookmarkStart w:id="162" w:name="section-1"/>
     <w:p>
       <w:pPr>
         <w:pStyle w:val="Heading2"/>
@@ -6944,8 +7394,8 @@
         <w:t xml:space="preserve">• POA&amp;M □ As acções graves e atrasadas são financiadas e retestadas de forma independente? Extensões repetidas sem decisão de risco</w:t>
       </w:r>
     </w:p>
-    <w:bookmarkEnd w:id="135"/>
-    <w:bookmarkStart w:id="136" w:name="ritmo-de-gerente"/>
+    <w:bookmarkEnd w:id="162"/>
+    <w:bookmarkStart w:id="163" w:name="ritmo-de-gerente"/>
     <w:p>
       <w:pPr>
         <w:pStyle w:val="Heading2"/>
@@ -6998,9 +7448,9 @@
         <w:t xml:space="preserve">Ciclo anual ou aprovado: estratégia de risco, controles comuns, valores de parâmetros, estratégia de monitoramento, capacidade do avaliador, qualidade do pacote, métricas e melhoria do processo.</w:t>
       </w:r>
     </w:p>
-    <w:bookmarkEnd w:id="136"/>
-    <w:bookmarkEnd w:id="137"/>
-    <w:bookmarkStart w:id="138" w:name="guia-de-carreira-do-analista-júnior"/>
+    <w:bookmarkEnd w:id="163"/>
+    <w:bookmarkEnd w:id="164"/>
+    <w:bookmarkStart w:id="168" w:name="guia-de-carreira-do-analista-júnior"/>
     <w:p>
       <w:pPr>
         <w:pStyle w:val="Heading1"/>
@@ -7023,8 +7473,58 @@
     </w:p>
     <w:p>
       <w:pPr>
-        <w:pStyle w:val="BodyText"/>
-      </w:pPr>
+        <w:pStyle w:val="CaptionedFigure"/>
+      </w:pPr>
+      <w:r>
+        <w:drawing>
+          <wp:inline>
+            <wp:extent cx="5334000" cy="2945449"/>
+            <wp:effectExtent b="0" l="0" r="0" t="0"/>
+            <wp:docPr descr="Trace cada conclusão da exigência à implementação, evidência, resultado, risco e ação." title="" id="166" name="Picture"/>
+            <a:graphic>
+              <a:graphicData uri="http://schemas.openxmlformats.org/drawingml/2006/picture">
+                <pic:pic>
+                  <pic:nvPicPr>
+                    <pic:cNvPr descr="media/image10.png" id="167" name="Picture"/>
+                    <pic:cNvPicPr>
+                      <a:picLocks noChangeArrowheads="1" noChangeAspect="1"/>
+                    </pic:cNvPicPr>
+                  </pic:nvPicPr>
+                  <pic:blipFill>
+                    <a:blip r:embed="rId165"/>
+                    <a:stretch>
+                      <a:fillRect/>
+                    </a:stretch>
+                  </pic:blipFill>
+                  <pic:spPr bwMode="auto">
+                    <a:xfrm>
+                      <a:off x="0" y="0"/>
+                      <a:ext cx="5334000" cy="2945449"/>
+                    </a:xfrm>
+                    <a:prstGeom prst="rect">
+                      <a:avLst/>
+                    </a:prstGeom>
+                    <a:noFill/>
+                    <a:ln w="9525">
+                      <a:noFill/>
+                      <a:headEnd/>
+                      <a:tailEnd/>
+                    </a:ln>
+                  </pic:spPr>
+                </pic:pic>
+              </a:graphicData>
+            </a:graphic>
+          </wp:inline>
+        </w:drawing>
+      </w:r>
+    </w:p>
+    <w:p>
+      <w:pPr>
+        <w:pStyle w:val="ImageCaption"/>
+      </w:pPr>
+      <w:r>
+        <w:t xml:space="preserve">Trace cada conclusão da exigência à implementação, evidência, resultado, risco e ação.</w:t>
+      </w:r>
     </w:p>
     <w:p>
       <w:pPr>
@@ -7034,8 +7534,8 @@
         <w:t xml:space="preserve">Figura 10. Caminho de analista RMF júnior</w:t>
       </w:r>
     </w:p>
-    <w:bookmarkEnd w:id="138"/>
-    <w:bookmarkStart w:id="139" w:name="funções-comuns"/>
+    <w:bookmarkEnd w:id="168"/>
+    <w:bookmarkStart w:id="169" w:name="funções-comuns"/>
     <w:p>
       <w:pPr>
         <w:pStyle w:val="Heading1"/>
@@ -7132,8 +7632,8 @@
         <w:t xml:space="preserve">Analisador de Monitoramento Contínuo</w:t>
       </w:r>
     </w:p>
-    <w:bookmarkEnd w:id="139"/>
-    <w:bookmarkStart w:id="140" w:name="trabalho-típico"/>
+    <w:bookmarkEnd w:id="169"/>
+    <w:bookmarkStart w:id="170" w:name="trabalho-típico"/>
     <w:p>
       <w:pPr>
         <w:pStyle w:val="Heading1"/>
@@ -7208,8 +7708,8 @@
         <w:t xml:space="preserve">Use CPRT, OSCAL, planilhas, repositórios, painéis e ferramentas técnicas aprovadas sem reivindicar autoridade além do papel.</w:t>
       </w:r>
     </w:p>
-    <w:bookmarkEnd w:id="140"/>
-    <w:bookmarkStart w:id="142" w:name="Xad9c5e5870a1d313a8afb95b48d15b486ae427d"/>
+    <w:bookmarkEnd w:id="170"/>
+    <w:bookmarkStart w:id="172" w:name="Xad9c5e5870a1d313a8afb95b48d15b486ae427d"/>
     <w:p>
       <w:pPr>
         <w:pStyle w:val="Heading1"/>
@@ -7244,7 +7744,7 @@
         <w:t xml:space="preserve">O que é que se passa?</w:t>
       </w:r>
     </w:p>
-    <w:bookmarkStart w:id="141" w:name="laboratório-de-portfólio"/>
+    <w:bookmarkStart w:id="171" w:name="laboratório-de-portfólio"/>
     <w:p>
       <w:pPr>
         <w:pStyle w:val="Heading2"/>
@@ -7363,9 +7863,9 @@
         <w:t xml:space="preserve">Publicar artefatos higiénicos claramente rotulados de ficção e não uma autorização NIST.</w:t>
       </w:r>
     </w:p>
-    <w:bookmarkEnd w:id="141"/>
-    <w:bookmarkEnd w:id="142"/>
-    <w:bookmarkStart w:id="144" w:name="plano-de-30-dias"/>
+    <w:bookmarkEnd w:id="171"/>
+    <w:bookmarkEnd w:id="172"/>
+    <w:bookmarkStart w:id="174" w:name="plano-de-30-dias"/>
     <w:p>
       <w:pPr>
         <w:pStyle w:val="Heading1"/>
@@ -7382,11 +7882,11 @@
         </w:numPr>
         <w:pStyle w:val="Heading2"/>
       </w:pPr>
-      <w:bookmarkStart w:id="143" w:name="dias-foco-entrega"/>
+      <w:bookmarkStart w:id="173" w:name="dias-foco-entrega"/>
       <w:r>
         <w:t xml:space="preserve">Dias** * Foco** * Entrega**</w:t>
       </w:r>
-      <w:bookmarkEnd w:id="143"/>
+      <w:bookmarkEnd w:id="173"/>
     </w:p>
     <w:p>
       <w:pPr>
@@ -7448,8 +7948,8 @@
         <w:t xml:space="preserve">Portfolio e entrevista</w:t>
       </w:r>
     </w:p>
-    <w:bookmarkEnd w:id="144"/>
-    <w:bookmarkStart w:id="151" w:name="o-que-é-rmf"/>
+    <w:bookmarkEnd w:id="174"/>
+    <w:bookmarkStart w:id="181" w:name="o-que-é-rmf"/>
     <w:p>
       <w:pPr>
         <w:pStyle w:val="Heading1"/>
@@ -7466,7 +7966,7 @@
         <w:t xml:space="preserve">Um processo de ciclo de vida de sete etapas para gerenciar o risco de segurança e privacidade: Preparar, categorizar, selecionar, implementar, avaliar, autorizar e monitorar.</w:t>
       </w:r>
     </w:p>
-    <w:bookmarkStart w:id="145" w:name="o-sp-800-53-é-uma-lista-de-verificação"/>
+    <w:bookmarkStart w:id="175" w:name="o-sp-800-53-é-uma-lista-de-verificação"/>
     <w:p>
       <w:pPr>
         <w:pStyle w:val="Heading2"/>
@@ -7483,8 +7983,8 @@
         <w:t xml:space="preserve">Não. É um catálogo de controle flexível. As organizações escolhem e adaptam os controlos através da gestão de riscos e dos requisitos aplicáveis.</w:t>
       </w:r>
     </w:p>
-    <w:bookmarkEnd w:id="145"/>
-    <w:bookmarkStart w:id="146" w:name="o-que-é-uma-linha-de-base"/>
+    <w:bookmarkEnd w:id="175"/>
+    <w:bookmarkStart w:id="176" w:name="o-que-é-uma-linha-de-base"/>
     <w:p>
       <w:pPr>
         <w:pStyle w:val="Heading2"/>
@@ -7501,8 +8001,8 @@
         <w:t xml:space="preserve">Um conjunto inicial de controles. A SP 800-53B fornece baixos, moderados, elevados e valores de privacidade para uso federal.</w:t>
       </w:r>
     </w:p>
-    <w:bookmarkEnd w:id="146"/>
-    <w:bookmarkStart w:id="147" w:name="o-que-é-alfaiataria"/>
+    <w:bookmarkEnd w:id="176"/>
+    <w:bookmarkStart w:id="177" w:name="o-que-é-alfaiataria"/>
     <w:p>
       <w:pPr>
         <w:pStyle w:val="Heading2"/>
@@ -7519,8 +8019,8 @@
         <w:t xml:space="preserve">Escopo documentado, parâmetros, adições, especialização, alocação e controles de compensação aprovados que fazem o conjunto inicial se encaixar no sistema e risco.</w:t>
       </w:r>
     </w:p>
-    <w:bookmarkEnd w:id="147"/>
-    <w:bookmarkStart w:id="148" w:name="o-que-é-a-herança-de-controle"/>
+    <w:bookmarkEnd w:id="177"/>
+    <w:bookmarkStart w:id="178" w:name="o-que-é-a-herança-de-controle"/>
     <w:p>
       <w:pPr>
         <w:pStyle w:val="Heading2"/>
@@ -7537,8 +8037,8 @@
         <w:t xml:space="preserve">Um sistema depende de um controle fornecido por outro provedor autorizado, enquanto ainda implementa e testa suas próprias responsabilidades de cliente.</w:t>
       </w:r>
     </w:p>
-    <w:bookmarkEnd w:id="148"/>
-    <w:bookmarkStart w:id="149" w:name="como-avalia-um-controle"/>
+    <w:bookmarkEnd w:id="178"/>
+    <w:bookmarkStart w:id="179" w:name="como-avalia-um-controle"/>
     <w:p>
       <w:pPr>
         <w:pStyle w:val="Heading2"/>
@@ -7555,8 +8055,8 @@
         <w:t xml:space="preserve">Utilizar objetivos aprovados e examinar, entrevistar ou testar métodos com objetos definidos, profundidade, cobertura, população, evidência, exceções e limitações.</w:t>
       </w:r>
     </w:p>
-    <w:bookmarkEnd w:id="149"/>
-    <w:bookmarkStart w:id="150" w:name="o-que-é-autorização"/>
+    <w:bookmarkEnd w:id="179"/>
+    <w:bookmarkStart w:id="180" w:name="o-que-é-autorização"/>
     <w:p>
       <w:pPr>
         <w:pStyle w:val="Heading2"/>
@@ -7573,9 +8073,9 @@
         <w:t xml:space="preserve">A decisão de um alto funcionário autorizado de aceitar um risco residual definido para um sistema ou controlos comuns nos termos indicados.</w:t>
       </w:r>
     </w:p>
-    <w:bookmarkEnd w:id="150"/>
-    <w:bookmarkEnd w:id="151"/>
-    <w:bookmarkStart w:id="152" w:name="o-que-é-um-poam"/>
+    <w:bookmarkEnd w:id="180"/>
+    <w:bookmarkEnd w:id="181"/>
+    <w:bookmarkStart w:id="182" w:name="o-que-é-um-poam"/>
     <w:p>
       <w:pPr>
         <w:pStyle w:val="Heading1"/>
@@ -7592,8 +8092,8 @@
         <w:t xml:space="preserve">Um plano rastreado para corrigir fraquezas identificadas, com risco, proprietário, marcos, recursos, programação, status e reteste.</w:t>
       </w:r>
     </w:p>
-    <w:bookmarkEnd w:id="152"/>
-    <w:bookmarkStart w:id="153" w:name="o-que-é-oscal"/>
+    <w:bookmarkEnd w:id="182"/>
+    <w:bookmarkStart w:id="183" w:name="o-que-é-oscal"/>
     <w:p>
       <w:pPr>
         <w:pStyle w:val="Heading1"/>
@@ -7610,8 +8110,8 @@
         <w:t xml:space="preserve">Modelos legíveis por máquina da NIST para controles, perfis, implementações, avaliações, resultados e POA&amp;Ms.</w:t>
       </w:r>
     </w:p>
-    <w:bookmarkEnd w:id="153"/>
-    <w:bookmarkStart w:id="154" w:name="o-que-é-atual-sp-800-53"/>
+    <w:bookmarkEnd w:id="183"/>
+    <w:bookmarkStart w:id="184" w:name="o-que-é-atual-sp-800-53"/>
     <w:p>
       <w:pPr>
         <w:pStyle w:val="Heading1"/>
@@ -7628,8 +8128,8 @@
         <w:t xml:space="preserve">Revisão 5, Release 5.2.0, emitida em agosto de 2025.</w:t>
       </w:r>
     </w:p>
-    <w:bookmarkEnd w:id="154"/>
-    <w:bookmarkStart w:id="157" w:name="modelos-glossário-índice-e-referências"/>
+    <w:bookmarkEnd w:id="184"/>
+    <w:bookmarkStart w:id="187" w:name="modelos-glossário-índice-e-referências"/>
     <w:p>
       <w:pPr>
         <w:pStyle w:val="Heading1"/>
@@ -7650,7 +8150,7 @@
         <w:t xml:space="preserve">Estruturas de trabalho reutilizáveis, termos-chave, índice de assunto e fontes oficiais.*</w:t>
       </w:r>
     </w:p>
-    <w:bookmarkStart w:id="156" w:name="registro-de-sistema-e-limite"/>
+    <w:bookmarkStart w:id="186" w:name="registro-de-sistema-e-limite"/>
     <w:p>
       <w:pPr>
         <w:pStyle w:val="Heading2"/>
@@ -7667,11 +8167,11 @@
         </w:numPr>
         <w:pStyle w:val="Heading2"/>
       </w:pPr>
-      <w:bookmarkStart w:id="155" w:name="campo-entrada"/>
+      <w:bookmarkStart w:id="185" w:name="campo-entrada"/>
       <w:r>
         <w:t xml:space="preserve">Campo** * Entrada**</w:t>
       </w:r>
-      <w:bookmarkEnd w:id="155"/>
+      <w:bookmarkEnd w:id="185"/>
     </w:p>
     <w:p>
       <w:pPr>
@@ -7757,9 +8257,9 @@
         <w:t xml:space="preserve">Aprovações/versão</w:t>
       </w:r>
     </w:p>
-    <w:bookmarkEnd w:id="156"/>
-    <w:bookmarkEnd w:id="157"/>
-    <w:bookmarkStart w:id="162" w:name="documento-de-implementação-de-controle"/>
+    <w:bookmarkEnd w:id="186"/>
+    <w:bookmarkEnd w:id="187"/>
+    <w:bookmarkStart w:id="192" w:name="documento-de-implementação-de-controle"/>
     <w:p>
       <w:pPr>
         <w:pStyle w:val="Heading1"/>
@@ -7776,11 +8276,11 @@
         </w:numPr>
         <w:pStyle w:val="Heading2"/>
       </w:pPr>
-      <w:bookmarkStart w:id="158" w:name="campo-entrada-1"/>
+      <w:bookmarkStart w:id="188" w:name="campo-entrada-1"/>
       <w:r>
         <w:t xml:space="preserve">Campo** * Entrada**</w:t>
       </w:r>
-      <w:bookmarkEnd w:id="158"/>
+      <w:bookmarkEnd w:id="188"/>
     </w:p>
     <w:p>
       <w:pPr>
@@ -7860,7 +8360,7 @@
         <w:t xml:space="preserve">• Proprietário/aprovação/atualização</w:t>
       </w:r>
     </w:p>
-    <w:bookmarkStart w:id="159" w:name="avaliação-e-registro-de-busca"/>
+    <w:bookmarkStart w:id="189" w:name="avaliação-e-registro-de-busca"/>
     <w:p>
       <w:pPr>
         <w:pStyle w:val="Heading2"/>
@@ -7971,8 +8471,8 @@
         <w:t xml:space="preserve">Reteste/fechamento</w:t>
       </w:r>
     </w:p>
-    <w:bookmarkEnd w:id="159"/>
-    <w:bookmarkStart w:id="161" w:name="registro-de-autorização-e-monitoramento"/>
+    <w:bookmarkEnd w:id="189"/>
+    <w:bookmarkStart w:id="191" w:name="registro-de-autorização-e-monitoramento"/>
     <w:p>
       <w:pPr>
         <w:pStyle w:val="Heading2"/>
@@ -7989,11 +8489,11 @@
         </w:numPr>
         <w:pStyle w:val="Heading2"/>
       </w:pPr>
-      <w:bookmarkStart w:id="160" w:name="campo-entrada-2"/>
+      <w:bookmarkStart w:id="190" w:name="campo-entrada-2"/>
       <w:r>
         <w:t xml:space="preserve">Campo** * Entrada**</w:t>
       </w:r>
-      <w:bookmarkEnd w:id="160"/>
+      <w:bookmarkEnd w:id="190"/>
     </w:p>
     <w:p>
       <w:pPr>
@@ -8073,9 +8573,9 @@
         <w:t xml:space="preserve">• Reautorização/fechamento</w:t>
       </w:r>
     </w:p>
-    <w:bookmarkEnd w:id="161"/>
-    <w:bookmarkEnd w:id="162"/>
-    <w:bookmarkStart w:id="164" w:name="glossário"/>
+    <w:bookmarkEnd w:id="191"/>
+    <w:bookmarkEnd w:id="192"/>
+    <w:bookmarkStart w:id="194" w:name="glossário"/>
     <w:p>
       <w:pPr>
         <w:pStyle w:val="Heading1"/>
@@ -8084,7 +8584,7 @@
         <w:t xml:space="preserve"># 30.5 Glossário</w:t>
       </w:r>
     </w:p>
-    <w:bookmarkStart w:id="163" w:name="section-2"/>
+    <w:bookmarkStart w:id="193" w:name="section-2"/>
     <w:p>
       <w:pPr>
         <w:pStyle w:val="Heading2"/>
@@ -8191,9 +8691,9 @@
         <w:t xml:space="preserve">Adaptação e especificação baseada em risco de um conjunto de controlo inicial.</w:t>
       </w:r>
     </w:p>
-    <w:bookmarkEnd w:id="163"/>
-    <w:bookmarkEnd w:id="164"/>
-    <w:bookmarkStart w:id="180" w:name="índice-de-assunto"/>
+    <w:bookmarkEnd w:id="193"/>
+    <w:bookmarkEnd w:id="194"/>
+    <w:bookmarkStart w:id="210" w:name="índice-de-assunto"/>
     <w:p>
       <w:pPr>
         <w:pStyle w:val="Heading1"/>
@@ -8202,7 +8702,7 @@
         <w:t xml:space="preserve"># 30.6 Índice de assunto</w:t>
       </w:r>
     </w:p>
-    <w:bookmarkStart w:id="165" w:name="sujeito-capítulo"/>
+    <w:bookmarkStart w:id="195" w:name="sujeito-capítulo"/>
     <w:p>
       <w:pPr>
         <w:pStyle w:val="Heading2"/>
@@ -8335,8 +8835,8 @@
         <w:t xml:space="preserve">Ferramentas</w:t>
       </w:r>
     </w:p>
-    <w:bookmarkEnd w:id="165"/>
-    <w:bookmarkStart w:id="178" w:name="referências-oficiais"/>
+    <w:bookmarkEnd w:id="195"/>
+    <w:bookmarkStart w:id="208" w:name="referências-oficiais"/>
     <w:p>
       <w:pPr>
         <w:pStyle w:val="Heading2"/>
@@ -8352,7 +8852,7 @@
           <w:numId w:val="1046"/>
         </w:numPr>
       </w:pPr>
-      <w:hyperlink r:id="rId166">
+      <w:hyperlink r:id="rId196">
         <w:r>
           <w:rPr>
             <w:rStyle w:val="Hyperlink"/>
@@ -8368,7 +8868,7 @@
           <w:numId w:val="1046"/>
         </w:numPr>
       </w:pPr>
-      <w:hyperlink r:id="rId167">
+      <w:hyperlink r:id="rId197">
         <w:r>
           <w:rPr>
             <w:rStyle w:val="Hyperlink"/>
@@ -8384,7 +8884,7 @@
           <w:numId w:val="1046"/>
         </w:numPr>
       </w:pPr>
-      <w:hyperlink r:id="rId168">
+      <w:hyperlink r:id="rId198">
         <w:r>
           <w:rPr>
             <w:rStyle w:val="Hyperlink"/>
@@ -8400,7 +8900,7 @@
           <w:numId w:val="1046"/>
         </w:numPr>
       </w:pPr>
-      <w:hyperlink r:id="rId169">
+      <w:hyperlink r:id="rId199">
         <w:r>
           <w:rPr>
             <w:rStyle w:val="Hyperlink"/>
@@ -8416,7 +8916,7 @@
           <w:numId w:val="1046"/>
         </w:numPr>
       </w:pPr>
-      <w:hyperlink r:id="rId170">
+      <w:hyperlink r:id="rId200">
         <w:r>
           <w:rPr>
             <w:rStyle w:val="Hyperlink"/>
@@ -8432,7 +8932,7 @@
           <w:numId w:val="1046"/>
         </w:numPr>
       </w:pPr>
-      <w:hyperlink r:id="rId171">
+      <w:hyperlink r:id="rId201">
         <w:r>
           <w:rPr>
             <w:rStyle w:val="Hyperlink"/>
@@ -8448,7 +8948,7 @@
           <w:numId w:val="1046"/>
         </w:numPr>
       </w:pPr>
-      <w:hyperlink r:id="rId172">
+      <w:hyperlink r:id="rId202">
         <w:r>
           <w:rPr>
             <w:rStyle w:val="Hyperlink"/>
@@ -8464,7 +8964,7 @@
           <w:numId w:val="1046"/>
         </w:numPr>
       </w:pPr>
-      <w:hyperlink r:id="rId173">
+      <w:hyperlink r:id="rId203">
         <w:r>
           <w:rPr>
             <w:rStyle w:val="Hyperlink"/>
@@ -8480,7 +8980,7 @@
           <w:numId w:val="1046"/>
         </w:numPr>
       </w:pPr>
-      <w:hyperlink r:id="rId174">
+      <w:hyperlink r:id="rId204">
         <w:r>
           <w:rPr>
             <w:rStyle w:val="Hyperlink"/>
@@ -8496,7 +8996,7 @@
           <w:numId w:val="1046"/>
         </w:numPr>
       </w:pPr>
-      <w:hyperlink r:id="rId100">
+      <w:hyperlink r:id="rId127">
         <w:r>
           <w:rPr>
             <w:rStyle w:val="Hyperlink"/>
@@ -8512,7 +9012,7 @@
           <w:numId w:val="1046"/>
         </w:numPr>
       </w:pPr>
-      <w:hyperlink r:id="rId175">
+      <w:hyperlink r:id="rId205">
         <w:r>
           <w:rPr>
             <w:rStyle w:val="Hyperlink"/>
@@ -8528,7 +9028,7 @@
           <w:numId w:val="1046"/>
         </w:numPr>
       </w:pPr>
-      <w:hyperlink r:id="rId176">
+      <w:hyperlink r:id="rId206">
         <w:r>
           <w:rPr>
             <w:rStyle w:val="Hyperlink"/>
@@ -8544,7 +9044,7 @@
           <w:numId w:val="1046"/>
         </w:numPr>
       </w:pPr>
-      <w:hyperlink r:id="rId177">
+      <w:hyperlink r:id="rId207">
         <w:r>
           <w:rPr>
             <w:rStyle w:val="Hyperlink"/>
@@ -8553,8 +9053,8 @@
         </w:r>
       </w:hyperlink>
     </w:p>
-    <w:bookmarkEnd w:id="178"/>
-    <w:bookmarkStart w:id="179" w:name="X9a3c6c700746bdf804c2452b71c6b949405b9a9"/>
+    <w:bookmarkEnd w:id="208"/>
+    <w:bookmarkStart w:id="209" w:name="X9a3c6c700746bdf804c2452b71c6b949405b9a9"/>
     <w:p>
       <w:pPr>
         <w:pStyle w:val="Heading2"/>
@@ -8563,8 +9063,8 @@
         <w:t xml:space="preserve">Lembrete final:** lançamentos NIST, linhas de base, parâmetros, sobreposições, sistemas, ameaças, leis, contratos, ferramentas e mudança de risco organizacional. Confirme a fonte oficial atual, a autoridade local e os requisitos aplicáveis antes da implementação, avaliação ou autorização. □</w:t>
       </w:r>
     </w:p>
-    <w:bookmarkEnd w:id="179"/>
-    <w:bookmarkEnd w:id="180"/>
+    <w:bookmarkEnd w:id="209"/>
+    <w:bookmarkEnd w:id="210"/>
     <w:sectPr/>
   </w:body>
 </w:document>

</xml_diff>